<commit_message>
fix: encabezado de tabla repetible, TOC autoactualizable y captura de cuenta sin email de testing
Marca la fila de encabezado de las tablas de RF/RNF de la Memoria
Técnica como repetible y no partible entre páginas (tblHeader +
cantSplit), y agrega updateFields en ambos documentos para que el
índice no quede vacío si no se actualiza a mano. Retoma la captura de
"Mi cuenta" del Manual con una cuenta de prueba cuyo email no delata
que es de testing.
</commit_message>
<xml_diff>
--- a/Laburin-Memoria-Tecnica.docx
+++ b/Laburin-Memoria-Tecnica.docx
@@ -1270,6 +1270,10 @@
         <w:gridCol w:w="6226"/>
       </w:tblGrid>
       <w:tr>
+        <w:trPr>
+          <w:cantSplit/>
+          <w:tblHeader/>
+        </w:trPr>
         <w:tc>
           <w:tcPr>
             <w:tcW w:type="dxa" w:w="1100"/>
@@ -2632,6 +2636,10 @@
         <w:gridCol w:w="6226"/>
       </w:tblGrid>
       <w:tr>
+        <w:trPr>
+          <w:cantSplit/>
+          <w:tblHeader/>
+        </w:trPr>
         <w:tc>
           <w:tcPr>
             <w:tcW w:type="dxa" w:w="1100"/>

</xml_diff>

<commit_message>
docs: scripts de generación al repo y correcciones de la Memoria Técnica
- Los scripts que generan los .docx pasan de una carpeta temporal a docs/scripts/ (con las capturas y el
  diagrama ER), con rutas relativas y sin credenciales: la cuenta de las capturas se genera al azar.
  Nuevos npm run docs:generar / docs:capturas / docs:der y una sección en el README.
- Memoria, Sección 6: el conteo del pase con Playwright ahora coincide con 'playwright test --list'
  (34 definidos: 16 por proyecto + 1 setup por proyecto; 33 en verde y 1 salteado).
- Memoria, Sección 8: el recálculo lento de scores se mide con precisión (25 s a 1,2 min con 1100
  ofertas) y propone la mejora (función SQL en una sola sentencia).
- docx como devDependency.
</commit_message>
<xml_diff>
--- a/Laburin-Memoria-Tecnica.docx
+++ b/Laburin-Memoria-Tecnica.docx
@@ -1124,7 +1124,7 @@
         <w:spacing w:after="160"/>
       </w:pPr>
       <w:r>
-        <w:t xml:space="preserve">Cubre: alta de usuario completa (registro, onboarding de 4 pasos con doble tap en "Continuar" en mobile, tablero vacío, criterios reflejados en Configuración); el ciclo de vida de una oferta (crear, ver el score, postular, moverla por las 6 columnas con drag-and-drop real en desktop y con el selector "Mover a..." en mobile, Ficha con interacciones, persistencia tras recargar); importación, filtros combinados y borrado masivo (también con la barra de selección en mobile); el efecto de un cambio de peso y de un criterio nuevo sobre el score; el umbral de inactividad (persistencia, validación y momento en que aparece el recordatorio); más de 1000 ofertas (paginación completa, filtros más allá de la fila 1000, contador, selección de las N que coinciden, deduplicación del import, Analytics y recálculo de scores); Mi cuenta (nombre, tema, contraseña); y sesión (cerrar, reingresar, rutas protegidas sin sesión). En total son 31 tests de punta a punta: 15 en desktop y 16 en mobile (el de teclado virtual es solo para mobile y en desktop se saltea de forma explícita), más una sesión de preparación por proyecto. La corrida final completa terminó con todos en verde y se hizo con la lógica pura de los cambios del pase cubierta aparte por 160 tests unitarios de Vitest.</w:t>
+        <w:t xml:space="preserve">Cubre: alta de usuario completa (registro, onboarding de 4 pasos con doble tap en "Continuar" en mobile, tablero vacío, criterios reflejados en Configuración); el ciclo de vida de una oferta (crear, ver el score, postular, moverla por las 6 columnas con drag-and-drop real en desktop y con el selector "Mover a..." en mobile, Ficha con interacciones, persistencia tras recargar); importación, filtros combinados y borrado masivo (también con la barra de selección en mobile); el efecto de un cambio de peso y de un criterio nuevo sobre el score; el umbral de inactividad (persistencia, validación y momento en que aparece el recordatorio); más de 1000 ofertas (paginación completa, filtros más allá de la fila 1000, contador, selección de las N que coinciden, deduplicación del import, Analytics y recálculo de scores); Mi cuenta (nombre, tema, contraseña); y sesión (cerrar, reingresar, rutas protegidas sin sesión). La suite define 34 tests: 16 por proyecto (32 en total) más una sesión de preparación por proyecto, que deja guardada la sesión de la cuenta compartida (2). En desktop, el test del teclado virtual solo aplica a mobile y se saltea de forma explícita, de modo que la corrida final completa ejecutó 33 tests (31 de punta a punta más las 2 sesiones de preparación), todos en verde, y 1 salteado. La lógica pura está cubierta aparte por 160 tests unitarios de Vitest.</w:t>
       </w:r>
     </w:p>
     <w:p>
@@ -1274,7 +1274,7 @@
         <w:spacing w:after="80"/>
       </w:pPr>
       <w:r>
-        <w:t xml:space="preserve">Recálculo de scores lento con volúmenes grandes: cambiar un peso con más de 1000 ofertas actualiza cientos de filas, de a diez en paralelo, y tarda del orden de un minuto en las pruebas con 1100 ofertas. Es correcto pero no instantáneo; una función SQL que lo haga en una sola sentencia lo resolvería.</w:t>
+        <w:t xml:space="preserve">Recálculo de scores lento con volúmenes grandes: cambiar un peso con más de 1000 ofertas actualiza cientos de filas, de a diez en paralelo, y en las pruebas con 1100 ofertas tardó entre 25 segundos y 1,2 minutos según la corrida (más de un minuto en la medición más lenta). Es correcto pero no instantáneo. Mejora posible: una función SQL que recalcule todos los puntajes en una sola sentencia, sin una escritura por fila.</w:t>
       </w:r>
     </w:p>
     <w:p>

</xml_diff>

<commit_message>
docs: Memoria Técnica con roles, mensajes, seguridad y privacidad, claridad de la interfaz y pruebas actualizadas
</commit_message>
<xml_diff>
--- a/Laburin-Memoria-Tecnica.docx
+++ b/Laburin-Memoria-Tecnica.docx
@@ -276,7 +276,33 @@
         <w:spacing w:after="80"/>
       </w:pPr>
       <w:r>
-        <w:t xml:space="preserve">Autenticación multiusuario real (registro, login, onboarding).</w:t>
+        <w:t xml:space="preserve">Autenticación multiusuario real: registro, inicio de sesión, recuperación de contraseña por email y configuración inicial guiada en 5 pasos.</w:t>
+      </w:r>
+    </w:p>
+    <w:p>
+      <w:pPr>
+        <w:pStyle w:val="ListParagraph"/>
+        <w:numPr>
+          <w:ilvl w:val="0"/>
+          <w:numId w:val="2"/>
+        </w:numPr>
+        <w:spacing w:after="80"/>
+      </w:pPr>
+      <w:r>
+        <w:t xml:space="preserve">Ampliación acordada con la docente el 08/10/2026: un rol de administrador que ve el perfil de búsqueda de los candidatos y les envía mensajes, y una sección Mensajes para el candidato con una bienvenida automática (Secciones 5.7 a 5.10 y 6).</w:t>
+      </w:r>
+    </w:p>
+    <w:p>
+      <w:pPr>
+        <w:pStyle w:val="ListParagraph"/>
+        <w:numPr>
+          <w:ilvl w:val="0"/>
+          <w:numId w:val="2"/>
+        </w:numPr>
+        <w:spacing w:after="80"/>
+      </w:pPr>
+      <w:r>
+        <w:t xml:space="preserve">Una interfaz pensada para quien no la conoce: secciones con nombres claros, ayuda en cada pantalla, estados vacíos que guían, tarjeta "Primeros pasos" y errores siempre en español (Sección 5.11).</w:t>
       </w:r>
     </w:p>
     <w:p>
@@ -301,7 +327,23 @@
         <w:spacing w:after="160"/>
       </w:pPr>
       <w:r>
-        <w:t xml:space="preserve">Además, durante el desarrollo se redujeron deliberadamente algunos puntos que la especificación original sí contemplaba (automatización periódica completa de 7 fuentes, reglas fijas de scoring heredadas del script anterior). La Sección 9 compara, punto por punto, qué de la especificación original se cumplió y qué quedó afuera a propósito.</w:t>
+        <w:t xml:space="preserve">Además, el 08/10/2026 la docente (Viviana Esterkin) pidió que, junto al lado de quien busca trabajo, exista el otro lado: la persona que recibe y revisa lo que cargan quienes se registran, y que puede escribirles. Eso amplió el alcance original (una herramienta personal de seguimiento) de forma mínima y acotada, y se documenta como ampliación acordada, no como parte de la especificación original. La Sección 6 describe cómo se resguardan los datos.</w:t>
+      </w:r>
+    </w:p>
+    <w:p>
+      <w:pPr>
+        <w:spacing w:after="160"/>
+      </w:pPr>
+      <w:r>
+        <w:t xml:space="preserve">Nombres de las pantallas: desde esa misma devolución, el Tablero se llama "Mis postulaciones", Analytics se llama "Mi progreso" y Configuración se llama "Mi perfil de búsqueda". Esta memoria usa los nombres anteriores cuando habla de decisiones tomadas antes del cambio.</w:t>
+      </w:r>
+    </w:p>
+    <w:p>
+      <w:pPr>
+        <w:spacing w:after="160"/>
+      </w:pPr>
+      <w:r>
+        <w:t xml:space="preserve">Además, durante el desarrollo se redujeron deliberadamente algunos puntos que la especificación original sí contemplaba (automatización periódica completa de 7 fuentes, reglas fijas de scoring heredadas del script anterior). La Sección 10 compara, punto por punto, qué de la especificación original se cumplió y qué quedó afuera a propósito.</w:t>
       </w:r>
     </w:p>
     <w:p>
@@ -335,7 +377,7 @@
         <w:spacing w:after="160"/>
       </w:pPr>
       <w:r>
-        <w:t xml:space="preserve">Backend: Supabase (PostgreSQL gestionado + Auth + Row Level Security), sin servidor propio. Cada tabla de dominio tiene RLS activado por user_id, de forma que un usuario solo puede leer y escribir sus propias filas — esto se verificó también como parte del testing (ver Sección 6).</w:t>
+        <w:t xml:space="preserve">Backend: Supabase (PostgreSQL gestionado + Auth + Row Level Security), sin servidor propio. Cada tabla de dominio tiene RLS activado por user_id, de forma que un usuario solo puede leer y escribir sus propias filas — esto se verificó también como parte del testing (ver Sección 7). Desde la ampliación del 08/10/2026 hay además un rol de administrador con permisos mínimos, acotados a nivel de columna (Sección 6).</w:t>
       </w:r>
     </w:p>
     <w:p>
@@ -456,7 +498,7 @@
           <w:sz w:val="19"/>
           <w:szCs w:val="19"/>
         </w:rPr>
-        <w:t xml:space="preserve">  features/        flujos multi-paso con estado propio</w:t>
+        <w:t xml:space="preserve">    auth/            AuthLayout, CampoPassword, MedidorPassword</w:t>
       </w:r>
       <w:r>
         <w:br/>
@@ -468,7 +510,7 @@
           <w:sz w:val="19"/>
           <w:szCs w:val="19"/>
         </w:rPr>
-        <w:t xml:space="preserve">    onboarding/      OnboardingWizard + steps/ (Rol, Stack, Modalidad, Seniority)</w:t>
+        <w:t xml:space="preserve">  features/        flujos multi-paso con estado propio</w:t>
       </w:r>
       <w:r>
         <w:br/>
@@ -480,7 +522,7 @@
           <w:sz w:val="19"/>
           <w:szCs w:val="19"/>
         </w:rPr>
-        <w:t xml:space="preserve">  pages/           una vista por ruta (Login, Offers, Tablero, Settings, Analytics, Onboarding)</w:t>
+        <w:t xml:space="preserve">    onboarding/      OnboardingWizard + steps/ (Nombre y rol, Tecnologías, Modalidad, Nivel, Resumen)</w:t>
       </w:r>
       <w:r>
         <w:br/>
@@ -492,7 +534,19 @@
           <w:sz w:val="19"/>
           <w:szCs w:val="19"/>
         </w:rPr>
-        <w:t xml:space="preserve">  hooks/           useAuth, useOnboarding, useTheme</w:t>
+        <w:t xml:space="preserve">  pages/           una vista por ruta (Login, Recuperar y Nueva contraseña, Offers, Tablero, Settings, Analytics, Mensajes, Candidatos, Onboarding)</w:t>
+      </w:r>
+      <w:r>
+        <w:br/>
+        <w:t xml:space="preserve"/>
+      </w:r>
+      <w:r>
+        <w:rPr>
+          <w:rFonts w:ascii="Consolas" w:cs="Consolas" w:eastAsia="Consolas" w:hAnsi="Consolas"/>
+          <w:sz w:val="19"/>
+          <w:szCs w:val="19"/>
+        </w:rPr>
+        <w:t xml:space="preserve">  hooks/           useAuth, useRol, useOnboarding, useTheme, useMensajesNoLeidos</w:t>
       </w:r>
       <w:r>
         <w:br/>
@@ -516,7 +570,7 @@
           <w:sz w:val="19"/>
           <w:szCs w:val="19"/>
         </w:rPr>
-        <w:t xml:space="preserve">  lib/             utilidades puras (errores, utils, passwordStrength, fuentes, seleccion, lotes, tags)</w:t>
+        <w:t xml:space="preserve">  lib/             utilidades puras (errores, authErrores, validacionAuth, rol, candidatos, mensajes, ubicaciones, utils, passwordStrength, fuentes, seleccion, lotes, tags)</w:t>
       </w:r>
       <w:r>
         <w:br/>
@@ -548,7 +602,7 @@
         <w:spacing w:after="160"/>
       </w:pPr>
       <w:r>
-        <w:t xml:space="preserve">La capa de services/ es la única que importa el cliente de Supabase: cada entidad del dominio (ofertas, postulaciones, interacciones, criteriosScoring, scoring, recordatorios, metricas, fuentesExternas, onboarding) tiene su propio archivo, y las páginas consumen esas funciones en vez de armar queries propias. Esto fue lo que permitió, por ejemplo, verificar en el pase de testing E2E que un recálculo de scoring dentro de un service se propaga solo, sin que ningún componente de React tenga que "acordarse" de refrescar nada (ver Sección 4).</w:t>
+        <w:t xml:space="preserve">La capa de services/ es la única que importa el cliente de Supabase: cada entidad del dominio (ofertas, postulaciones, interacciones, criteriosScoring, scoring, recordatorios, metricas, fuentesExternas, onboarding, roles, candidatos, mensajes) tiene su propio archivo, y las páginas consumen esas funciones en vez de armar queries propias. Esto fue lo que permitió, por ejemplo, verificar en el pase de testing E2E que un recálculo de scoring dentro de un service se propaga solo, sin que ningún componente de React tenga que "acordarse" de refrescar nada (ver Sección 4).</w:t>
       </w:r>
     </w:p>
     <w:p>
@@ -565,7 +619,7 @@
         <w:spacing w:after="160"/>
       </w:pPr>
       <w:r>
-        <w:t xml:space="preserve">El esquema vive enteramente en PostgreSQL (Supabase), con RLS por user_id en cada tabla de dominio. El siguiente diagrama resume las entidades y sus relaciones reales, tal como quedaron definidas en las migraciones de supabase/migrations/.</w:t>
+        <w:t xml:space="preserve">El esquema vive enteramente en PostgreSQL (Supabase), con RLS por user_id en cada tabla de dominio. El siguiente diagrama resume las entidades y sus relaciones reales, tal como quedaron definidas en las migraciones de supabase/migrations/. En verde están las tablas y la vista agregadas con la ampliación del 08/10/2026.</w:t>
       </w:r>
     </w:p>
     <w:p>
@@ -582,7 +636,7 @@
       <w:r>
         <w:drawing>
           <wp:inline distT="0" distB="0" distL="0" distR="0">
-            <wp:extent cx="5524500" cy="3248025"/>
+            <wp:extent cx="5524500" cy="3962400"/>
             <wp:effectExtent t="0" r="0" b="0" l="0"/>
             <wp:docPr id="1" name="" descr="" title=""/>
             <wp:cNvGraphicFramePr>
@@ -607,7 +661,7 @@
                   <pic:spPr bwMode="auto">
                     <a:xfrm>
                       <a:off x="0" y="0"/>
-                      <a:ext cx="5524500" cy="3248025"/>
+                      <a:ext cx="5524500" cy="3962400"/>
                     </a:xfrm>
                     <a:prstGeom prst="rect">
                       <a:avLst/>
@@ -668,7 +722,59 @@
         <w:spacing w:after="80"/>
       </w:pPr>
       <w:r>
-        <w:t xml:space="preserve">Toda tabla de dominio (perfil_usuario, criterios_scoring, ofertas, postulaciones, interacciones, recordatorios, postulacion_historial_estados) referencia a auth.users mediante user_id, con RLS activado — este patrón se adoptó desde el modelado inicial (SRS, RNF-02), antes de que se decidiera construir la funcionalidad de multi-usuario completa (ver Sección 7).</w:t>
+        <w:t xml:space="preserve">Toda tabla de dominio (perfil_usuario, criterios_scoring, ofertas, postulaciones, interacciones, recordatorios, postulacion_historial_estados) referencia a auth.users mediante user_id, con RLS activado — este patrón se adoptó desde el modelado inicial (SRS, RNF-02), antes de que se decidiera construir la funcionalidad de multi-usuario completa (ver Sección 8).</w:t>
+      </w:r>
+    </w:p>
+    <w:p>
+      <w:pPr>
+        <w:pStyle w:val="ListParagraph"/>
+        <w:numPr>
+          <w:ilvl w:val="0"/>
+          <w:numId w:val="2"/>
+        </w:numPr>
+        <w:spacing w:after="80"/>
+      </w:pPr>
+      <w:r>
+        <w:t xml:space="preserve">roles_usuario guarda el rol de cada persona (candidato o administrador); sin fila, es candidato. La aplicación solo puede leerla: no tiene permiso ni política de escritura, de modo que nadie puede escalar su propio rol, y el administrador se asigna por SQL (Sección 5.7).</w:t>
+      </w:r>
+    </w:p>
+    <w:p>
+      <w:pPr>
+        <w:pStyle w:val="ListParagraph"/>
+        <w:numPr>
+          <w:ilvl w:val="0"/>
+          <w:numId w:val="2"/>
+        </w:numPr>
+        <w:spacing w:after="80"/>
+      </w:pPr>
+      <w:r>
+        <w:t xml:space="preserve">candidatos es una vista de solo lectura sobre perfil_usuario, con las columnas del perfil de búsqueda; solo devuelve filas si quien consulta es administrador (Sección 5.8).</w:t>
+      </w:r>
+    </w:p>
+    <w:p>
+      <w:pPr>
+        <w:pStyle w:val="ListParagraph"/>
+        <w:numPr>
+          <w:ilvl w:val="0"/>
+          <w:numId w:val="2"/>
+        </w:numPr>
+        <w:spacing w:after="80"/>
+      </w:pPr>
+      <w:r>
+        <w:t xml:space="preserve">mensajes guarda remitente (nulo para los del sistema), destinatario, tipo (admin o bienvenida), texto de 1 a 1000 caracteres y si fue leído; la bienvenida la inserta un trigger (Sección 5.9).</w:t>
+      </w:r>
+    </w:p>
+    <w:p>
+      <w:pPr>
+        <w:pStyle w:val="ListParagraph"/>
+        <w:numPr>
+          <w:ilvl w:val="0"/>
+          <w:numId w:val="2"/>
+        </w:numPr>
+        <w:spacing w:after="80"/>
+      </w:pPr>
+      <w:r>
+        <w:t xml:space="preserve">perfil_usuario.nombre es el nombre para mostrar, que ve el administrador. El email no se copia al perfil: el administrador no lo ve.</w:t>
       </w:r>
     </w:p>
     <w:p>
@@ -887,7 +993,7 @@
         <w:spacing w:after="160"/>
       </w:pPr>
       <w:r>
-        <w:t xml:space="preserve">Esto responde directamente a la limitación #1 identificada en el antecedente (SRS, §3.6): en el script v5.0 todo el peso de cada señal de scoring estaba hardcodeado en un objeto CONFIG, y cambiar una keyword o un peso requería editar y redeployar el script. Exponer peso, campo_objetivo y valor_comparacion como filas editables en criterios_scoring (tabla, no código) elimina esa fricción: el usuario ajusta sus prioridades desde la UI de Configuración, sin pasar por un deploy.</w:t>
+        <w:t xml:space="preserve">Esto responde directamente a la limitación #1 identificada en el antecedente (SRS, §3.6): en el script v5.0 todo el peso de cada señal de scoring estaba hardcodeado en un objeto CONFIG, y cambiar una keyword o un peso requería editar y redeployar el script. Exponer peso, campo_objetivo y valor_comparacion como filas editables en criterios_scoring (tabla, no código) elimina esa fricción: el usuario ajusta sus prioridades desde Mi perfil de búsqueda (antes Configuración), sin pasar por un deploy.</w:t>
       </w:r>
     </w:p>
     <w:p>
@@ -1031,7 +1137,7 @@
         <w:spacing w:after="160"/>
       </w:pPr>
       <w:r>
-        <w:t xml:space="preserve">El listado de Ofertas traía todas las filas y filtraba en el navegador; como Supabase corta cada lectura en 1000 filas, pasado ese volumen se perdían ofertas sin ningún aviso. La alternativa más barata era seguir trayendo todo, por lotes, y filtrar en memoria; se descartó porque con miles de ofertas cargaría y mantendría todo en el cliente para mostrar treinta tarjetas. Se resolvió con paginación en el servidor (range() con conteo exacto) y los tres filtros (fuente, ubicación, score mínimo) aplicados en la propia consulta.</w:t>
+        <w:t xml:space="preserve">El listado de Ofertas traía todas las filas y filtraba en el navegador; como Supabase corta cada lectura en 1000 filas, pasado ese volumen se perdían ofertas sin ningún aviso. La alternativa más barata era seguir trayendo todo, por lotes, y filtrar en memoria; se descartó porque con miles de ofertas cargaría y mantendría todo en el cliente para mostrar treinta tarjetas. Se resolvió con paginación en el servidor (range() con conteo exacto) y los tres filtros (fuente, ubicación, puntaje mínimo) aplicados en la propia consulta.</w:t>
       </w:r>
     </w:p>
     <w:p>
@@ -1040,6 +1146,107 @@
       </w:pPr>
       <w:r>
         <w:t xml:space="preserve">El borrado masivo se rediseñó para que haga exactamente lo que dice. La casilla de la cabecera selecciona la página visible y lo aclara en su texto; cuando hay más coincidencias que las visibles aparece un enlace "Seleccionar las N ofertas que coinciden con los filtros", que trae solo los ids por lotes. "Eliminar seleccionadas (N)" borra siempre esos N. La deduplicación del import dejó de depender de tener las ofertas cargadas: consulta, por lotes y solo con las columnas necesarias, las claves ya guardadas de las fuentes que se importan. Las demás lecturas "de todo" (Analytics, Tablero, recordatorios, historial) leen por lotes con un helper común (leerEnLotes) con orden estable.</w:t>
+      </w:r>
+    </w:p>
+    <w:p>
+      <w:pPr>
+        <w:pStyle w:val="Heading2"/>
+        <w:spacing w:after="140" w:before="280"/>
+      </w:pPr>
+      <w:r>
+        <w:t xml:space="preserve">5.7 Roles en una tabla aparte, no como columna del perfil</w:t>
+      </w:r>
+    </w:p>
+    <w:p>
+      <w:pPr>
+        <w:spacing w:after="160"/>
+      </w:pPr>
+      <w:r>
+        <w:t xml:space="preserve">La primera idea fue agregar una columna rol a perfil_usuario. Se descartó: esa tabla ya deja que cada usuario escriba su propia fila (el Onboarding lo necesita), así que con una columna de rol cualquiera podría hacerse administrador con un simple upsert, y habría que blindar insert, update y upsert con permisos por columna. Se creó roles_usuario, que los usuarios solo pueden leer: sin permiso de escritura ni política de escritura no existe ningún camino de escalada. Sin fila, la persona es candidata, así que no hace falta un trigger al registrarse. El rol administrador se asigna a mano, por SQL, a las cuentas que indica el responsable del proyecto.</w:t>
+      </w:r>
+    </w:p>
+    <w:p>
+      <w:pPr>
+        <w:pStyle w:val="Heading2"/>
+        <w:spacing w:after="140" w:before="280"/>
+      </w:pPr>
+      <w:r>
+        <w:t xml:space="preserve">5.8 El administrador lee una vista, no la tabla de perfiles</w:t>
+      </w:r>
+    </w:p>
+    <w:p>
+      <w:pPr>
+        <w:spacing w:after="160"/>
+      </w:pPr>
+      <w:r>
+        <w:t xml:space="preserve">La alternativa era darle al administrador una política de lectura sobre perfil_usuario. Se descartó porque habría expuesto la fila completa (por ejemplo, el umbral de recordatorios y el estado del onboarding). En su lugar, la vista candidatos expone solo nombre, rol buscado, tecnologías, modalidad, ubicación, nivel y fecha de registro, solo devuelve filas si es_administrador() es verdadera y excluye a los propios administradores.</w:t>
+      </w:r>
+    </w:p>
+    <w:p>
+      <w:pPr>
+        <w:spacing w:after="160"/>
+      </w:pPr>
+      <w:r>
+        <w:t xml:space="preserve">Una vista simple es actualizable con los permisos de su dueño, y en Supabase los objetos nuevos nacen con permisos para los roles de la API. Por eso a la vista se le quitaron todos los permisos y se otorgó únicamente SELECT: por ella no se puede insertar, actualizar ni borrar. La misma regla (revoke all y recién después el permiso mínimo) se aplicó a cada tabla, vista y función nueva.</w:t>
+      </w:r>
+    </w:p>
+    <w:p>
+      <w:pPr>
+        <w:pStyle w:val="Heading2"/>
+        <w:spacing w:after="140" w:before="280"/>
+      </w:pPr>
+      <w:r>
+        <w:t xml:space="preserve">5.9 La bienvenida la manda un trigger de base de datos</w:t>
+      </w:r>
+    </w:p>
+    <w:p>
+      <w:pPr>
+        <w:spacing w:after="160"/>
+      </w:pPr>
+      <w:r>
+        <w:t xml:space="preserve">Se evaluó insertar el mensaje desde la aplicación al terminar el Onboarding. Se descartó: un cliente podría saltearlo o falsificarlo, y la aplicación tendría que acordarse de hacerlo en cada camino. Un trigger sobre perfil_usuario lo inserta en el momento en que el perfil pasa a completo con un rol cargado, y un índice único parcial impide duplicarlo. Quien usa "Omitir por ahora" no lo recibe, porque "tu perfil quedó registrado" no sería cierto. El administrador, por su parte, solo puede enviar mensajes de tipo admin firmados con su propio id.</w:t>
+      </w:r>
+    </w:p>
+    <w:p>
+      <w:pPr>
+        <w:pStyle w:val="Heading2"/>
+        <w:spacing w:after="140" w:before="280"/>
+      </w:pPr>
+      <w:r>
+        <w:t xml:space="preserve">5.10 El destinatario puede borrar sus mensajes</w:t>
+      </w:r>
+    </w:p>
+    <w:p>
+      <w:pPr>
+        <w:spacing w:after="160"/>
+      </w:pPr>
+      <w:r>
+        <w:t xml:space="preserve">Los mensajes pertenecen a quien los recibe: puede marcarlos como leídos (es lo único que puede cambiar de un mensaje; el texto, el remitente y el destinatario están protegidos por permisos de columna) y borrarlos. Es un control razonable de la bandeja propia, y además permite que las pruebas automáticas limpien sus datos sin una service role key. El costo aceptado: si la persona borra un mensaje, el administrador lo pierde de su historial de enviados.</w:t>
+      </w:r>
+    </w:p>
+    <w:p>
+      <w:pPr>
+        <w:pStyle w:val="Heading2"/>
+        <w:spacing w:after="140" w:before="280"/>
+      </w:pPr>
+      <w:r>
+        <w:t xml:space="preserve">5.11 Claridad para quien no conoce la aplicación</w:t>
+      </w:r>
+    </w:p>
+    <w:p>
+      <w:pPr>
+        <w:spacing w:after="160"/>
+      </w:pPr>
+      <w:r>
+        <w:t xml:space="preserve">El 08/10/2026 la docente señaló que la aplicación funcionaba pero solo se entendía si ya se sabía usar. La respuesta fue un pase de claridad: secciones con nombres entendibles en el orden en que se usan, una línea de ayuda bajo cada título, estados vacíos con un botón hacia el paso siguiente, una tarjeta cerrable "Primeros pasos", la configuración inicial en 5 pasos con validación y resumen editable, errores de autenticación traducidos al español sin revelar cuál de los dos datos es el incorrecto, recuperación de contraseña por email, y avisos aclarados (el umbral de inactividad solo muestra un recordatorio: no borra nada). Las URLs anteriores siguen funcionando con redirecciones.</w:t>
+      </w:r>
+    </w:p>
+    <w:p>
+      <w:pPr>
+        <w:spacing w:after="160"/>
+      </w:pPr>
+      <w:r>
+        <w:t xml:space="preserve">Una decisión con alternativa fue el largo mínimo de la contraseña. Se subió a 8 en registro, recuperación y Mi cuenta, pero el inicio de sesión no lo exige, para que las cuentas anteriores sigan entrando. El medidor de fortaleza orienta, pero no bloquea.</w:t>
       </w:r>
     </w:p>
     <w:p>
@@ -1048,7 +1255,15 @@
         <w:spacing w:after="200" w:before="400"/>
       </w:pPr>
       <w:r>
-        <w:t xml:space="preserve">6. Testing</w:t>
+        <w:t xml:space="preserve">6. Seguridad y privacidad</w:t>
+      </w:r>
+    </w:p>
+    <w:p>
+      <w:pPr>
+        <w:spacing w:after="160"/>
+      </w:pPr>
+      <w:r>
+        <w:t xml:space="preserve">Esta sección reúne cómo se protegen los datos de cada persona y qué puede ver cada rol. El diseño se detalla en las Secciones 5.7 a 5.10; acá se resume el resultado y cómo se verificó.</w:t>
       </w:r>
     </w:p>
     <w:p>
@@ -1057,15 +1272,59 @@
         <w:spacing w:after="140" w:before="280"/>
       </w:pPr>
       <w:r>
-        <w:t xml:space="preserve">Metodología</w:t>
-      </w:r>
-    </w:p>
-    <w:p>
-      <w:pPr>
-        <w:spacing w:after="160"/>
-      </w:pPr>
-      <w:r>
-        <w:t xml:space="preserve">Las funciones puras del dominio (motor de scoring, criterios, recordatorios, métricas, utilidades) se desarrollaron bajo TDD con Vitest: test en rojo antes de la implementación, luego verde. Todo lo que es integración UI–backend se verificó, a falta de navegador disponible durante gran parte del desarrollo, mediante una combinación de lectura de código y verificación directa contra una instancia real de Supabase — nunca contra mocks. En el pase final se sumó una suite de Playwright con un navegador real (Chromium), separada de Vitest: npm run test corre solo los tests unitarios y npm run test:e2e corre la suite de punta a punta.</w:t>
+        <w:t xml:space="preserve">Modelo de acceso</w:t>
+      </w:r>
+    </w:p>
+    <w:p>
+      <w:pPr>
+        <w:pStyle w:val="ListParagraph"/>
+        <w:numPr>
+          <w:ilvl w:val="0"/>
+          <w:numId w:val="2"/>
+        </w:numPr>
+        <w:spacing w:after="80"/>
+      </w:pPr>
+      <w:r>
+        <w:t xml:space="preserve">Candidato: ve y modifica únicamente lo suyo. Todas las tablas de dominio tienen RLS por user_id, igual que antes de la ampliación.</w:t>
+      </w:r>
+    </w:p>
+    <w:p>
+      <w:pPr>
+        <w:pStyle w:val="ListParagraph"/>
+        <w:numPr>
+          <w:ilvl w:val="0"/>
+          <w:numId w:val="2"/>
+        </w:numPr>
+        <w:spacing w:after="80"/>
+      </w:pPr>
+      <w:r>
+        <w:t xml:space="preserve">Administrador: no tiene política sobre ninguna tabla personal. Solo lee la vista candidatos y puede enviar mensajes de tipo admin firmados con su propio id.</w:t>
+      </w:r>
+    </w:p>
+    <w:p>
+      <w:pPr>
+        <w:pStyle w:val="ListParagraph"/>
+        <w:numPr>
+          <w:ilvl w:val="0"/>
+          <w:numId w:val="2"/>
+        </w:numPr>
+        <w:spacing w:after="80"/>
+      </w:pPr>
+      <w:r>
+        <w:t xml:space="preserve">Sin sesión: no accede a nada de lo nuevo (roles, mensajes ni candidatos).</w:t>
+      </w:r>
+    </w:p>
+    <w:p>
+      <w:pPr>
+        <w:pStyle w:val="ListParagraph"/>
+        <w:numPr>
+          <w:ilvl w:val="0"/>
+          <w:numId w:val="2"/>
+        </w:numPr>
+        <w:spacing w:after="80"/>
+      </w:pPr>
+      <w:r>
+        <w:t xml:space="preserve">Permisos mínimos por objeto: roles_usuario solo SELECT; candidatos solo SELECT; mensajes SELECT, INSERT y DELETE, y UPDATE únicamente de la columna leido; es_administrador() solo ejecutable por usuarios con sesión; la función del trigger de bienvenida no es ejecutable por la API.</w:t>
       </w:r>
     </w:p>
     <w:p>
@@ -1074,15 +1333,33 @@
         <w:spacing w:after="140" w:before="280"/>
       </w:pPr>
       <w:r>
-        <w:t xml:space="preserve">Pase de QA</w:t>
-      </w:r>
-    </w:p>
-    <w:p>
-      <w:pPr>
-        <w:spacing w:after="160"/>
-      </w:pPr>
-      <w:r>
-        <w:t xml:space="preserve">Auditoría sistemática de toda la app por lectura de código, clasificada en bloqueante / importante / menor. No se encontraron bloqueantes. Se corrigieron 3 hallazgos importantes — el campo de peso "pegado" en 0 al editar un criterio existente, ausencia de límites mínimo/máximo en los campos de peso (un peso negativo restaba puntos de forma silenciosa), y el botón "Cancelar" del modal de oferta que no bloqueaba un guardado ya en curso — y 2 menores: ausencia de maxLength en todos los campos de texto, y falta de feedback visual durante la verificación inicial de sesión. Dos hallazgos menores quedaron en ese momento fuera de alcance a pedido explícito — duplicados casi-idénticos de tags de stack por mayúsculas o espacios, y el límite de 1000 filas por defecto de Supabase sin paginar — y se resolvieron en el pase final (Secciones 5.6 y 6, Pase con Playwright).</w:t>
+        <w:t xml:space="preserve">Qué datos ve el administrador</w:t>
+      </w:r>
+    </w:p>
+    <w:p>
+      <w:pPr>
+        <w:pStyle w:val="ListParagraph"/>
+        <w:numPr>
+          <w:ilvl w:val="0"/>
+          <w:numId w:val="2"/>
+        </w:numPr>
+        <w:spacing w:after="80"/>
+      </w:pPr>
+      <w:r>
+        <w:t xml:space="preserve">Ve: el nombre y el perfil de búsqueda de cada candidato que completó su perfil (rol buscado, tecnologías, modalidad, ubicación, nivel de experiencia) y la fecha de registro. Los candidatos que omitieron el Onboarding no se listan.</w:t>
+      </w:r>
+    </w:p>
+    <w:p>
+      <w:pPr>
+        <w:pStyle w:val="ListParagraph"/>
+        <w:numPr>
+          <w:ilvl w:val="0"/>
+          <w:numId w:val="2"/>
+        </w:numPr>
+        <w:spacing w:after="80"/>
+      </w:pPr>
+      <w:r>
+        <w:t xml:space="preserve">No ve: ofertas, postulaciones, interacciones, recordatorios, criterios de scoring, historial de estados, el email, el umbral de recordatorios ni los mensajes de otras personas.</w:t>
       </w:r>
     </w:p>
     <w:p>
@@ -1091,7 +1368,7 @@
         <w:spacing w:after="140" w:before="280"/>
       </w:pPr>
       <w:r>
-        <w:t xml:space="preserve">Pase E2E</w:t>
+        <w:t xml:space="preserve">Aviso al usuario</w:t>
       </w:r>
     </w:p>
     <w:p>
@@ -1099,7 +1376,7 @@
         <w:spacing w:after="160"/>
       </w:pPr>
       <w:r>
-        <w:t xml:space="preserve">Seis flujos de punta a punta (alta de usuario, ciclo de vida completo de una oferta, importación con scoring y filtros, configuración afectando el scoring en vivo, recordatorios por inactividad, sesión y navegación) verificados con dos fuentes de evidencia combinadas: un script temporal contra la instancia real de Supabase de producción (con autorización explícita), que ejecutó 33 verificaciones concretas contra las mismas tablas, triggers y RLS que usa la aplicación — las 33 en verde — y trazado de código para la parte puramente de React (qué se re-renderiza y qué se vuelve a pedir al navegar entre pantallas). No se encontraron hallazgos nuevos. El reporte documenta explícitamente lo que esta metodología no puede cubrir — la sensación real del drag-and-drop, el timing exacto de un click, el comportamiento de una sesión abierta muchas horas — como zonas ciegas honestas, no como bugs descartados. El pase con Playwright, descrito a continuación, cerró varias de ellas.</w:t>
+        <w:t xml:space="preserve">Cada persona ve este aviso antes de dar sus datos y cada vez que los revisa: "Tu nombre y tu perfil de búsqueda (rol, tecnologías, modalidad, ubicación y nivel) los puede ver el equipo de Laburin. Tus ofertas y postulaciones son solo tuyas." Se muestra en el primer paso de la configuración inicial (junto al nombre), en el resumen final y en Mi cuenta.</w:t>
       </w:r>
     </w:p>
     <w:p>
@@ -1108,7 +1385,7 @@
         <w:spacing w:after="140" w:before="280"/>
       </w:pPr>
       <w:r>
-        <w:t xml:space="preserve">Pase con Playwright</w:t>
+        <w:t xml:space="preserve">Pruebas de seguridad</w:t>
       </w:r>
     </w:p>
     <w:p>
@@ -1116,31 +1393,85 @@
         <w:spacing w:after="160"/>
       </w:pPr>
       <w:r>
-        <w:t xml:space="preserve">Una suite de Playwright con Chromium real, contra la aplicación levantada con Vite y la base real de Supabase, en dos proyectos: desktop (1280x800) y mobile (375x812, con touch). Corre con un solo worker porque comparte base y una cuenta por proyecto. Las cuentas de prueba se crean por el propio flujo de registro de la aplicación, las credenciales viven en un archivo de entorno que no se versiona, y la siembra y la limpieza de datos se hacen con el cliente de Supabase autenticado como el usuario de prueba — es decir, respetando RLS, sin ninguna service role key. Al terminar, un teardown borra todos los datos de las cuentas de prueba.</w:t>
-      </w:r>
-    </w:p>
-    <w:p>
-      <w:pPr>
-        <w:spacing w:after="160"/>
-      </w:pPr>
-      <w:r>
-        <w:t xml:space="preserve">Cubre: alta de usuario completa (registro, onboarding de 4 pasos con doble tap en "Continuar" en mobile, tablero vacío, criterios reflejados en Configuración); el ciclo de vida de una oferta (crear, ver el score, postular, moverla por las 6 columnas con drag-and-drop real en desktop y con el selector "Mover a..." en mobile, Ficha con interacciones, persistencia tras recargar); importación, filtros combinados y borrado masivo (también con la barra de selección en mobile); el efecto de un cambio de peso y de un criterio nuevo sobre el score; el umbral de inactividad (persistencia, validación y momento en que aparece el recordatorio); más de 1000 ofertas (paginación completa, filtros más allá de la fila 1000, contador, selección de las N que coinciden, deduplicación del import, Analytics y recálculo de scores); Mi cuenta (nombre, tema, contraseña); y sesión (cerrar, reingresar, rutas protegidas sin sesión). La suite define 34 tests: 16 por proyecto (32 en total) más una sesión de preparación por proyecto, que deja guardada la sesión de la cuenta compartida (2). En desktop, el test del teclado virtual solo aplica a mobile y se saltea de forma explícita, de modo que la corrida final completa ejecutó 33 tests (31 de punta a punta más las 2 sesiones de preparación), todos en verde, y 1 salteado. La lógica pura está cubierta aparte por 160 tests unitarios de Vitest.</w:t>
-      </w:r>
-    </w:p>
-    <w:p>
-      <w:pPr>
-        <w:spacing w:after="160"/>
-      </w:pPr>
-      <w:r>
-        <w:t xml:space="preserve">Hallazgos reales que encontró y que se corrigieron, cada uno con su test: (1) una carrera en el Tablero — una lectura inicial tardía pisaba el primer movimiento y devolvía la tarjeta a su columna aunque la base ya la había guardado; se corrigió descartando la respuesta de una corrida cancelada y se cubrió con un test que reproduce la respuesta vieja de forma determinista (falla sin el arreglo, pasa con él); (2) controles sin nombre accesible — pesos, botones de borrar y agregar de Configuración, filtros de Ofertas, el estado de la Ficha, los botones de cerrar — y modales sin role="dialog"; (3) el resumen de la importación decía "1 ofertas nuevas importadas". Además, una de las fallas intermitentes resultó ser un error de sincronización del propio test y se corrigió ahí, sin tocar la aplicación.</w:t>
-      </w:r>
-    </w:p>
-    <w:p>
-      <w:pPr>
-        <w:spacing w:after="160"/>
-      </w:pPr>
-      <w:r>
-        <w:t xml:space="preserve">Zonas ciegas del pase anterior que se cerraron: la sensación real del drag-and-drop en desktop (incluido el recorrido por las 6 columnas) y el timing de los clicks, ahora con un navegador real; el doble tap en el Onboarding; el selector "Mover a..." y la barra de selección en una pantalla de 375 px. Zonas ciegas que siguen abiertas: el teclado virtual real (solo se simula su efecto reduciendo el viewport; no se puede automatizar con fiabilidad); el comportamiento en un celular real y en otros motores (solo se probó Chromium, no WebKit/Safari ni hardware real); el autoscroll del navegador al arrastrar una tarjeta cerca del borde (el test desplaza el tablero antes de arrastrar); y la disponibilidad de Remotive y Arbeitnow (el import usa respuestas simuladas, con un único test de humo contra los servicios reales).</w:t>
+        <w:t xml:space="preserve">Una suite adversarial de 13 pruebas corre contra la base real, sin navegador y sin service role key: usa la clave pública con sesiones reales de dos candidatos creados en cada corrida y de la cuenta de administrador de pruebas, es decir, con las mismas reglas que tiene un usuario de la aplicación. Cada ataque se considera exitoso solo si es rechazado (error de permisos o de política) o queda sin efecto (0 filas), y en los casos de escritura se verifica además que el dato ajeno siga intacto. Las 13 pasaron. Cubren:</w:t>
+      </w:r>
+    </w:p>
+    <w:p>
+      <w:pPr>
+        <w:pStyle w:val="ListParagraph"/>
+        <w:numPr>
+          <w:ilvl w:val="0"/>
+          <w:numId w:val="2"/>
+        </w:numPr>
+        <w:spacing w:after="80"/>
+      </w:pPr>
+      <w:r>
+        <w:t xml:space="preserve">Candidato contra candidato: no lee perfil, mensajes, ofertas, postulaciones, interacciones, recordatorios, criterios ni historial ajenos; no modifica ni borra datos ajenos; no inserta filas a nombre de otro.</w:t>
+      </w:r>
+    </w:p>
+    <w:p>
+      <w:pPr>
+        <w:pStyle w:val="ListParagraph"/>
+        <w:numPr>
+          <w:ilvl w:val="0"/>
+          <w:numId w:val="2"/>
+        </w:numPr>
+        <w:spacing w:after="80"/>
+      </w:pPr>
+      <w:r>
+        <w:t xml:space="preserve">Escalada de rol: un candidato no puede insertar, hacer upsert, actualizar ni borrar en roles_usuario, y es_administrador() le devuelve falso. La vista candidatos le devuelve 0 filas y rechaza cualquier escritura.</w:t>
+      </w:r>
+    </w:p>
+    <w:p>
+      <w:pPr>
+        <w:pStyle w:val="ListParagraph"/>
+        <w:numPr>
+          <w:ilvl w:val="0"/>
+          <w:numId w:val="2"/>
+        </w:numPr>
+        <w:spacing w:after="80"/>
+      </w:pPr>
+      <w:r>
+        <w:t xml:space="preserve">Mensajes: de un mensaje solo se puede cambiar el estado leído; no se puede editar el texto, el remitente ni el destinatario, ni enviar a nombre del sistema o de otra persona.</w:t>
+      </w:r>
+    </w:p>
+    <w:p>
+      <w:pPr>
+        <w:pStyle w:val="ListParagraph"/>
+        <w:numPr>
+          <w:ilvl w:val="0"/>
+          <w:numId w:val="2"/>
+        </w:numPr>
+        <w:spacing w:after="80"/>
+      </w:pPr>
+      <w:r>
+        <w:t xml:space="preserve">Administrador: lee solo las columnas acordadas de candidatos (pedir otras da error de columna inexistente) y 0 filas de todo lo privado, incluida una oferta y una nota sembradas a propósito; no puede insertar, actualizar ni borrar en candidatos, perfil_usuario ni roles_usuario, ni cambiar su propio rol; envía como él mismo y no puede suplantar remitente o tipo, ni leer, editar, marcar o borrar lo ajeno.</w:t>
+      </w:r>
+    </w:p>
+    <w:p>
+      <w:pPr>
+        <w:pStyle w:val="ListParagraph"/>
+        <w:numPr>
+          <w:ilvl w:val="0"/>
+          <w:numId w:val="2"/>
+        </w:numPr>
+        <w:spacing w:after="80"/>
+      </w:pPr>
+      <w:r>
+        <w:t xml:space="preserve">Sin sesión: todo lo nuevo da error de permisos, y perfil_usuario devuelve 0 filas.</w:t>
+      </w:r>
+    </w:p>
+    <w:p>
+      <w:pPr>
+        <w:pStyle w:val="ListParagraph"/>
+        <w:numPr>
+          <w:ilvl w:val="0"/>
+          <w:numId w:val="2"/>
+        </w:numPr>
+        <w:spacing w:after="80"/>
+      </w:pPr>
+      <w:r>
+        <w:t xml:space="preserve">Bienvenida: se envía una sola vez al completar el perfil con un rol, no se duplica y no se envía a quien omite el Onboarding.</w:t>
       </w:r>
     </w:p>
     <w:p>
@@ -1149,15 +1480,46 @@
         <w:spacing w:after="140" w:before="280"/>
       </w:pPr>
       <w:r>
-        <w:t xml:space="preserve">Bugs de producción</w:t>
-      </w:r>
-    </w:p>
-    <w:p>
-      <w:pPr>
-        <w:spacing w:after="160"/>
-      </w:pPr>
-      <w:r>
-        <w:t xml:space="preserve">Aparte de los dos pases anteriores, el uso real en dispositivos móviles encontró y corrigió 4 bugs puntuales: el teclado virtual tapando el campo enfocado, un doble tap en el Onboarding que dejaba dos pantallas superpuestas, la lista de Ofertas sin refrescar tras importar, y un problema de layout responsivo en la barra de selección múltiple de Ofertas.</w:t>
+        <w:t xml:space="preserve">Límites</w:t>
+      </w:r>
+    </w:p>
+    <w:p>
+      <w:pPr>
+        <w:pStyle w:val="ListParagraph"/>
+        <w:numPr>
+          <w:ilvl w:val="0"/>
+          <w:numId w:val="2"/>
+        </w:numPr>
+        <w:spacing w:after="80"/>
+      </w:pPr>
+      <w:r>
+        <w:t xml:space="preserve">El rol administrador se asigna por SQL y depende de quien tenga acceso al panel de la base; no hay una pantalla para gestionarlo.</w:t>
+      </w:r>
+    </w:p>
+    <w:p>
+      <w:pPr>
+        <w:pStyle w:val="ListParagraph"/>
+        <w:numPr>
+          <w:ilvl w:val="0"/>
+          <w:numId w:val="2"/>
+        </w:numPr>
+        <w:spacing w:after="80"/>
+      </w:pPr>
+      <w:r>
+        <w:t xml:space="preserve">El administrador ve el nombre que cada persona escribió; no se verifica que sea su nombre real.</w:t>
+      </w:r>
+    </w:p>
+    <w:p>
+      <w:pPr>
+        <w:pStyle w:val="ListParagraph"/>
+        <w:numPr>
+          <w:ilvl w:val="0"/>
+          <w:numId w:val="2"/>
+        </w:numPr>
+        <w:spacing w:after="80"/>
+      </w:pPr>
+      <w:r>
+        <w:t xml:space="preserve">Los datos de pruebas usan cuentas propias y se borran al terminar. Los usuarios de Auth de prueba quedan, porque borrarlos requeriría una service role key, que el proyecto no usa.</w:t>
       </w:r>
     </w:p>
     <w:p>
@@ -1166,7 +1528,16 @@
         <w:spacing w:after="200" w:before="400"/>
       </w:pPr>
       <w:r>
-        <w:t xml:space="preserve">7. Trabajo fuera del alcance original</w:t>
+        <w:t xml:space="preserve">7. Testing</w:t>
+      </w:r>
+    </w:p>
+    <w:p>
+      <w:pPr>
+        <w:pStyle w:val="Heading2"/>
+        <w:spacing w:after="140" w:before="280"/>
+      </w:pPr>
+      <w:r>
+        <w:t xml:space="preserve">Metodología</w:t>
       </w:r>
     </w:p>
     <w:p>
@@ -1174,85 +1545,132 @@
         <w:spacing w:after="160"/>
       </w:pPr>
       <w:r>
-        <w:t xml:space="preserve">Cosas construidas durante el desarrollo que no estaban en la especificación original, o que la contradicen explícitamente:</w:t>
-      </w:r>
-    </w:p>
-    <w:p>
-      <w:pPr>
-        <w:pStyle w:val="ListParagraph"/>
-        <w:numPr>
-          <w:ilvl w:val="0"/>
-          <w:numId w:val="2"/>
-        </w:numPr>
-        <w:spacing w:after="80"/>
-      </w:pPr>
-      <w:r>
-        <w:t xml:space="preserve">Multi-usuario funcional completo: la SRS (§7.3, RNF-02) preveía dejar el modelo de datos preparado para multi-usuario, pero explícitamente no construir pantallas de registro público ni onboarding genérico durante esta PPS — el sistema se evaluaría con el perfil único del autor. En la práctica se construyó el flujo completo de registro, login y onboarding de 4 pasos, y el proyecto se evalúa como multi-usuario real.</w:t>
-      </w:r>
-    </w:p>
-    <w:p>
-      <w:pPr>
-        <w:pStyle w:val="ListParagraph"/>
-        <w:numPr>
-          <w:ilvl w:val="0"/>
-          <w:numId w:val="2"/>
-        </w:numPr>
-        <w:spacing w:after="80"/>
-      </w:pPr>
-      <w:r>
-        <w:t xml:space="preserve">Pase de usabilidad y mobile completo: sidebar responsivo con drawer, el selector como fallback del Kanban en mobile (Sección 5.1), ajuste de touch targets a 44px, y visibilidad de botones hover-only en pantallas táctiles. No estaba contemplado en los requerimientos funcionales originales.</w:t>
-      </w:r>
-    </w:p>
-    <w:p>
-      <w:pPr>
-        <w:pStyle w:val="ListParagraph"/>
-        <w:numPr>
-          <w:ilvl w:val="0"/>
-          <w:numId w:val="2"/>
-        </w:numPr>
-        <w:spacing w:after="80"/>
-      </w:pPr>
-      <w:r>
-        <w:t xml:space="preserve">Identidad visual: medidor de fortaleza de contraseña, mostrar/ocultar contraseña, fondo ambient con formas difuminadas (más marcado en Login/Registro, atenuado en el resto de la app) y tema claro/oscuro. Trabajo de pulido visual no pedido por la SRS.</w:t>
-      </w:r>
-    </w:p>
-    <w:p>
-      <w:pPr>
-        <w:pStyle w:val="ListParagraph"/>
-        <w:numPr>
-          <w:ilvl w:val="0"/>
-          <w:numId w:val="2"/>
-        </w:numPr>
-        <w:spacing w:after="80"/>
-      </w:pPr>
-      <w:r>
-        <w:t xml:space="preserve">postulacion_historial_estados: tabla y trigger adicionales para registrar automáticamente cada cambio de estado de una postulación, no pedidos explícitamente en la SRS — se agregaron para sostener con datos reales el Panel de Métricas (tiempo promedio por etapa).</w:t>
-      </w:r>
-    </w:p>
-    <w:p>
-      <w:pPr>
-        <w:pStyle w:val="ListParagraph"/>
-        <w:numPr>
-          <w:ilvl w:val="0"/>
-          <w:numId w:val="2"/>
-        </w:numPr>
-        <w:spacing w:after="80"/>
-      </w:pPr>
-      <w:r>
-        <w:t xml:space="preserve">Tres pases de verificación completos (QA, E2E contra la base real y una suite de Playwright con navegador real, desktop y mobile), además de los tests unitarios — un nivel de rigor de verificación no exigido explícitamente por la especificación funcional.</w:t>
-      </w:r>
-    </w:p>
-    <w:p>
-      <w:pPr>
-        <w:pStyle w:val="ListParagraph"/>
-        <w:numPr>
-          <w:ilvl w:val="0"/>
-          <w:numId w:val="2"/>
-        </w:numPr>
-        <w:spacing w:after="80"/>
-      </w:pPr>
-      <w:r>
-        <w:t xml:space="preserve">Paginación en servidor del listado de Ofertas y lecturas por lotes en todo el sistema, para que la aplicación siga correcta pasado el límite de 1000 filas por lectura de Supabase (Sección 5.6).</w:t>
+        <w:t xml:space="preserve">Las funciones puras del dominio (motor de scoring, criterios, recordatorios, métricas, utilidades) se desarrollaron bajo TDD con Vitest: test en rojo antes de la implementación, luego verde. Todo lo que es integración UI–backend se verificó, a falta de navegador disponible durante gran parte del desarrollo, mediante una combinación de lectura de código y verificación directa contra una instancia real de Supabase — nunca contra mocks. En el pase final se sumó una suite de Playwright con un navegador real (Chromium), separada de Vitest: npm run test corre solo los tests unitarios y npm run test:e2e corre la suite de punta a punta.</w:t>
+      </w:r>
+    </w:p>
+    <w:p>
+      <w:pPr>
+        <w:pStyle w:val="Heading2"/>
+        <w:spacing w:after="140" w:before="280"/>
+      </w:pPr>
+      <w:r>
+        <w:t xml:space="preserve">Pase de QA</w:t>
+      </w:r>
+    </w:p>
+    <w:p>
+      <w:pPr>
+        <w:spacing w:after="160"/>
+      </w:pPr>
+      <w:r>
+        <w:t xml:space="preserve">Auditoría sistemática de toda la app por lectura de código, clasificada en bloqueante / importante / menor. No se encontraron bloqueantes. Se corrigieron 3 hallazgos importantes — el campo de peso "pegado" en 0 al editar un criterio existente, ausencia de límites mínimo/máximo en los campos de peso (un peso negativo restaba puntos de forma silenciosa), y el botón "Cancelar" del modal de oferta que no bloqueaba un guardado ya en curso — y 2 menores: ausencia de maxLength en todos los campos de texto, y falta de feedback visual durante la verificación inicial de sesión. Dos hallazgos menores quedaron en ese momento fuera de alcance a pedido explícito — duplicados casi-idénticos de tags de stack por mayúsculas o espacios, y el límite de 1000 filas por defecto de Supabase sin paginar — y se resolvieron en el pase final (Secciones 5.6 y 7, Pase con Playwright).</w:t>
+      </w:r>
+    </w:p>
+    <w:p>
+      <w:pPr>
+        <w:pStyle w:val="Heading2"/>
+        <w:spacing w:after="140" w:before="280"/>
+      </w:pPr>
+      <w:r>
+        <w:t xml:space="preserve">Pase E2E</w:t>
+      </w:r>
+    </w:p>
+    <w:p>
+      <w:pPr>
+        <w:spacing w:after="160"/>
+      </w:pPr>
+      <w:r>
+        <w:t xml:space="preserve">Seis flujos de punta a punta (alta de usuario, ciclo de vida completo de una oferta, importación con scoring y filtros, configuración afectando el scoring en vivo, recordatorios por inactividad, sesión y navegación) verificados con dos fuentes de evidencia combinadas: un script temporal contra la instancia real de Supabase de producción (con autorización explícita), que ejecutó 33 verificaciones concretas contra las mismas tablas, triggers y RLS que usa la aplicación — las 33 en verde — y trazado de código para la parte puramente de React (qué se re-renderiza y qué se vuelve a pedir al navegar entre pantallas). No se encontraron hallazgos nuevos. El reporte documenta explícitamente lo que esta metodología no puede cubrir — la sensación real del drag-and-drop, el timing exacto de un click, el comportamiento de una sesión abierta muchas horas — como zonas ciegas honestas, no como bugs descartados. El pase con Playwright, descrito a continuación, cerró varias de ellas.</w:t>
+      </w:r>
+    </w:p>
+    <w:p>
+      <w:pPr>
+        <w:pStyle w:val="Heading2"/>
+        <w:spacing w:after="140" w:before="280"/>
+      </w:pPr>
+      <w:r>
+        <w:t xml:space="preserve">Pase con Playwright</w:t>
+      </w:r>
+    </w:p>
+    <w:p>
+      <w:pPr>
+        <w:spacing w:after="160"/>
+      </w:pPr>
+      <w:r>
+        <w:t xml:space="preserve">Una suite de Playwright con Chromium real, contra la aplicación levantada con Vite y la base real de Supabase, en dos proyectos: desktop (1280x800) y mobile (375x812, con touch). Corre con un solo worker porque comparte base y una cuenta por proyecto. Las cuentas de prueba se crean por el propio flujo de registro de la aplicación, las credenciales viven en un archivo de entorno que no se versiona, y la siembra y la limpieza de datos se hacen con el cliente de Supabase autenticado como el usuario de prueba — es decir, respetando RLS, sin ninguna service role key. Al terminar, un teardown borra todos los datos de las cuentas de prueba.</w:t>
+      </w:r>
+    </w:p>
+    <w:p>
+      <w:pPr>
+        <w:spacing w:after="160"/>
+      </w:pPr>
+      <w:r>
+        <w:t xml:space="preserve">Cubre: alta de usuario completa (registro, configuración inicial de 5 pasos con doble tap en "Continuar" en mobile, Mis postulaciones vacío, criterios reflejados en Mi perfil de búsqueda); el ciclo de vida de una oferta (crear, ver el score, postular, moverla por las 6 columnas con drag-and-drop real en desktop y con el selector "Mover a..." en mobile, Ficha con interacciones, persistencia tras recargar); importación, filtros combinados y borrado masivo (también con la barra de selección en mobile); el efecto de un cambio de peso y de un criterio nuevo sobre el score; el umbral de inactividad (persistencia, validación y momento en que aparece el recordatorio); más de 1000 ofertas (paginación completa, filtros más allá de la fila 1000, contador, selección de las N que coinciden, deduplicación del import, Analytics y recálculo de scores); Mi cuenta (nombre, tema, contraseña); y sesión (cerrar, reingresar, rutas protegidas sin sesión). Las cifras de la corrida final, que incluye los pases posteriores, están en el Pase de claridad y roles.</w:t>
+      </w:r>
+    </w:p>
+    <w:p>
+      <w:pPr>
+        <w:spacing w:after="160"/>
+      </w:pPr>
+      <w:r>
+        <w:t xml:space="preserve">Hallazgos reales que encontró y que se corrigieron, cada uno con su test: (1) una carrera en el Tablero — una lectura inicial tardía pisaba el primer movimiento y devolvía la tarjeta a su columna aunque la base ya la había guardado; se corrigió descartando la respuesta de una corrida cancelada y se cubrió con un test que reproduce la respuesta vieja de forma determinista (falla sin el arreglo, pasa con él); (2) controles sin nombre accesible — pesos, botones de borrar y agregar de Configuración, filtros de Ofertas, el estado de la Ficha, los botones de cerrar — y modales sin role="dialog"; (3) el resumen de la importación decía "1 ofertas nuevas importadas". Además, una de las fallas intermitentes resultó ser un error de sincronización del propio test y se corrigió ahí, sin tocar la aplicación.</w:t>
+      </w:r>
+    </w:p>
+    <w:p>
+      <w:pPr>
+        <w:spacing w:after="160"/>
+      </w:pPr>
+      <w:r>
+        <w:t xml:space="preserve">Zonas ciegas del pase anterior que se cerraron: la sensación real del drag-and-drop en desktop (incluido el recorrido por las 6 columnas) y el timing de los clicks, ahora con un navegador real; el doble tap en el Onboarding; el selector "Mover a..." y la barra de selección en una pantalla de 375 px. Zonas ciegas que siguen abiertas: el teclado virtual real (solo se simula su efecto reduciendo el viewport; no se puede automatizar con fiabilidad); el comportamiento en un celular real y en otros motores (solo se probó Chromium, no WebKit/Safari ni hardware real); el autoscroll del navegador al arrastrar una tarjeta cerca del borde (el test desplaza el tablero antes de arrastrar); y la disponibilidad de Remotive y Arbeitnow (el import usa respuestas simuladas, con un único test de humo contra los servicios reales).</w:t>
+      </w:r>
+    </w:p>
+    <w:p>
+      <w:pPr>
+        <w:pStyle w:val="Heading2"/>
+        <w:spacing w:after="140" w:before="280"/>
+      </w:pPr>
+      <w:r>
+        <w:t xml:space="preserve">Pase de claridad y roles</w:t>
+      </w:r>
+    </w:p>
+    <w:p>
+      <w:pPr>
+        <w:spacing w:after="160"/>
+      </w:pPr>
+      <w:r>
+        <w:t xml:space="preserve">Con la devolución de la docente y la ampliación del 08/10/2026 se sumaron especificaciones de Playwright que cubren lo nuevo: navegación y redirecciones de las URLs anteriores; acceso y recuperación de contraseña (validaciones en español, errores traducidos, mensaje neutro, enlace vencido y nueva contraseña, con el envío de mails interceptado para no depender de ningún correo real ni de sus límites); filtros de Ofertas (ubicación con sugerencias, puntaje mínimo según el perfil, sin resultados) y aviso de perfil vacío; configuración inicial de 5 pasos con validaciones, texto sin agregar y duplicados; un recorrido completo de una persona que no conoce la aplicación, desde un registro con errores a propósito hasta volver a entrar; el flujo entre candidato y administrador (bienvenida, listado, envío de un mensaje, no leído, marcado como leído, y el acceso por rol, incluido el intento de entrar a Candidatos por URL); y la suite adversarial de seguridad de la Sección 6.</w:t>
+      </w:r>
+    </w:p>
+    <w:p>
+      <w:pPr>
+        <w:spacing w:after="160"/>
+      </w:pPr>
+      <w:r>
+        <w:t xml:space="preserve">Cifras de la corrida final completa (desktop y mobile, contra la base real): 244 tests unitarios de Vitest en 22 archivos y 93 tests de Playwright, todos en verde y ninguno salteado. De los 93, 2 son sesiones de preparación, 51 corren en desktop (13 de ellos son las pruebas de seguridad, que hablan directo con la API y por eso corren una sola vez) y 40 corren en mobile. El test del teclado virtual solo aplica a mobile y se excluye del proyecto desktop por configuración, en lugar de figurar como salteado en cada corrida.</w:t>
+      </w:r>
+    </w:p>
+    <w:p>
+      <w:pPr>
+        <w:spacing w:after="160"/>
+      </w:pPr>
+      <w:r>
+        <w:t xml:space="preserve">Hallazgos de este pase que se corrigieron: los textos de interfaz que seguían en inglés o con jerga ("pipeline", "Timeline", "Stack tecnológico", "Score", "pts"), los mensajes de error de autenticación en inglés y un ayudante de las pruebas que intentaba abrir el menú móvil ya abierto. Además, las credenciales de la cuenta de administrador de pruebas se ubicaron por error en un archivo de ejemplo versionado; se detectó antes de commitear, se movieron al archivo de entorno que no se versiona y nunca llegaron al repositorio.</w:t>
+      </w:r>
+    </w:p>
+    <w:p>
+      <w:pPr>
+        <w:pStyle w:val="Heading2"/>
+        <w:spacing w:after="140" w:before="280"/>
+      </w:pPr>
+      <w:r>
+        <w:t xml:space="preserve">Bugs de producción</w:t>
+      </w:r>
+    </w:p>
+    <w:p>
+      <w:pPr>
+        <w:spacing w:after="160"/>
+      </w:pPr>
+      <w:r>
+        <w:t xml:space="preserve">Aparte de los dos pases anteriores, el uso real en dispositivos móviles encontró y corrigió 4 bugs puntuales: el teclado virtual tapando el campo enfocado, un doble tap en el Onboarding que dejaba dos pantallas superpuestas, la lista de Ofertas sin refrescar tras importar, y un problema de layout responsivo en la barra de selección múltiple de Ofertas.</w:t>
       </w:r>
     </w:p>
     <w:p>
@@ -1261,98 +1679,119 @@
         <w:spacing w:after="200" w:before="400"/>
       </w:pPr>
       <w:r>
-        <w:t xml:space="preserve">8. Limitaciones conocidas y trabajo futuro</w:t>
-      </w:r>
-    </w:p>
-    <w:p>
-      <w:pPr>
-        <w:pStyle w:val="ListParagraph"/>
-        <w:numPr>
-          <w:ilvl w:val="0"/>
-          <w:numId w:val="2"/>
-        </w:numPr>
-        <w:spacing w:after="80"/>
-      </w:pPr>
-      <w:r>
-        <w:t xml:space="preserve">Recálculo de scores lento con volúmenes grandes: cambiar un peso con más de 1000 ofertas actualiza cientos de filas, de a diez en paralelo, y en las pruebas con 1100 ofertas tardó entre 25 segundos y 1,2 minutos según la corrida (más de un minuto en la medición más lenta). Es correcto pero no instantáneo. Mejora posible: una función SQL que recalcule todos los puntajes en una sola sentencia, sin una escritura por fila.</w:t>
-      </w:r>
-    </w:p>
-    <w:p>
-      <w:pPr>
-        <w:pStyle w:val="ListParagraph"/>
-        <w:numPr>
-          <w:ilvl w:val="0"/>
-          <w:numId w:val="2"/>
-        </w:numPr>
-        <w:spacing w:after="80"/>
-      </w:pPr>
-      <w:r>
-        <w:t xml:space="preserve">Importar ofertas inserta una por una (cada alta lee la sesión y los criterios): con muchas ofertas nuevas es lento. Un insert por lotes lo mejoraría.</w:t>
-      </w:r>
-    </w:p>
-    <w:p>
-      <w:pPr>
-        <w:pStyle w:val="ListParagraph"/>
-        <w:numPr>
-          <w:ilvl w:val="0"/>
-          <w:numId w:val="2"/>
-        </w:numPr>
-        <w:spacing w:after="80"/>
-      </w:pPr>
-      <w:r>
-        <w:t xml:space="preserve">Sin pruebas en un celular real ni en otros motores, y sin automatizar el teclado virtual real: la suite de Playwright usa Chromium emulado y solo simula el efecto del teclado (Sección 6).</w:t>
-      </w:r>
-    </w:p>
-    <w:p>
-      <w:pPr>
-        <w:pStyle w:val="ListParagraph"/>
-        <w:numPr>
-          <w:ilvl w:val="0"/>
-          <w:numId w:val="2"/>
-        </w:numPr>
-        <w:spacing w:after="80"/>
-      </w:pPr>
-      <w:r>
-        <w:t xml:space="preserve">Solo 2 de las 7 fuentes originales, sin automatización periódica: la búsqueda de ofertas externas depende de que el usuario toque "Importar" — no hay job de fondo (Sección 5.2 y 5.3).</w:t>
-      </w:r>
-    </w:p>
-    <w:p>
-      <w:pPr>
-        <w:pStyle w:val="ListParagraph"/>
-        <w:numPr>
-          <w:ilvl w:val="0"/>
-          <w:numId w:val="2"/>
-        </w:numPr>
-        <w:spacing w:after="80"/>
-      </w:pPr>
-      <w:r>
-        <w:t xml:space="preserve">Sin notificación por email: los recordatorios solo viven dentro de la aplicación (badge en Tablero y Ficha), no hay el mail de resumen diario que tenía el antecedente.</w:t>
-      </w:r>
-    </w:p>
-    <w:p>
-      <w:pPr>
-        <w:pStyle w:val="ListParagraph"/>
-        <w:numPr>
-          <w:ilvl w:val="0"/>
-          <w:numId w:val="2"/>
-        </w:numPr>
-        <w:spacing w:after="80"/>
-      </w:pPr>
-      <w:r>
-        <w:t xml:space="preserve">El motor de scoring no portó las reglas fijas heredadas del script anterior (recencia, seniority, exclusiones por keyword, idioma, salario): el puntaje depende exclusivamente de los criterios que el usuario configure. Si el usuario no configura ningún criterio, no hay ninguna señal de calidad de base.</w:t>
-      </w:r>
-    </w:p>
-    <w:p>
-      <w:pPr>
-        <w:pStyle w:val="ListParagraph"/>
-        <w:numPr>
-          <w:ilvl w:val="0"/>
-          <w:numId w:val="2"/>
-        </w:numPr>
-        <w:spacing w:after="80"/>
-      </w:pPr>
-      <w:r>
-        <w:t xml:space="preserve">Sin categorización de rol (QA / Data Entry / Admin / Data Analyst, u otra taxonomía): no hay forma de filtrar o tagear ofertas por categoría de puesto más allá de los criterios de texto libre que arme el propio usuario.</w:t>
+        <w:t xml:space="preserve">8. Trabajo fuera del alcance original</w:t>
+      </w:r>
+    </w:p>
+    <w:p>
+      <w:pPr>
+        <w:spacing w:after="160"/>
+      </w:pPr>
+      <w:r>
+        <w:t xml:space="preserve">Cosas construidas durante el desarrollo que no estaban en la especificación original, o que la contradicen explícitamente:</w:t>
+      </w:r>
+    </w:p>
+    <w:p>
+      <w:pPr>
+        <w:pStyle w:val="ListParagraph"/>
+        <w:numPr>
+          <w:ilvl w:val="0"/>
+          <w:numId w:val="2"/>
+        </w:numPr>
+        <w:spacing w:after="80"/>
+      </w:pPr>
+      <w:r>
+        <w:t xml:space="preserve">Multi-usuario funcional completo: la SRS (§7.3, RNF-02) preveía dejar el modelo de datos preparado para multi-usuario, pero explícitamente no construir pantallas de registro público ni onboarding genérico durante esta PPS — el sistema se evaluaría con el perfil único del autor. En la práctica se construyó el flujo completo de registro, login, recuperación de contraseña y configuración inicial de 5 pasos, y el proyecto se evalúa como multi-usuario real.</w:t>
+      </w:r>
+    </w:p>
+    <w:p>
+      <w:pPr>
+        <w:pStyle w:val="ListParagraph"/>
+        <w:numPr>
+          <w:ilvl w:val="0"/>
+          <w:numId w:val="2"/>
+        </w:numPr>
+        <w:spacing w:after="80"/>
+      </w:pPr>
+      <w:r>
+        <w:t xml:space="preserve">Pase de usabilidad y mobile completo: sidebar responsivo con drawer, el selector como fallback del Kanban en mobile (Sección 5.1), ajuste de touch targets a 44px, y visibilidad de botones hover-only en pantallas táctiles. No estaba contemplado en los requerimientos funcionales originales.</w:t>
+      </w:r>
+    </w:p>
+    <w:p>
+      <w:pPr>
+        <w:pStyle w:val="ListParagraph"/>
+        <w:numPr>
+          <w:ilvl w:val="0"/>
+          <w:numId w:val="2"/>
+        </w:numPr>
+        <w:spacing w:after="80"/>
+      </w:pPr>
+      <w:r>
+        <w:t xml:space="preserve">Identidad visual: medidor de fortaleza de contraseña, mostrar/ocultar contraseña, fondo ambient con formas difuminadas (más marcado en Login/Registro, atenuado en el resto de la app) y tema claro/oscuro. Trabajo de pulido visual no pedido por la SRS.</w:t>
+      </w:r>
+    </w:p>
+    <w:p>
+      <w:pPr>
+        <w:pStyle w:val="ListParagraph"/>
+        <w:numPr>
+          <w:ilvl w:val="0"/>
+          <w:numId w:val="2"/>
+        </w:numPr>
+        <w:spacing w:after="80"/>
+      </w:pPr>
+      <w:r>
+        <w:t xml:space="preserve">postulacion_historial_estados: tabla y trigger adicionales para registrar automáticamente cada cambio de estado de una postulación, no pedidos explícitamente en la SRS — se agregaron para sostener con datos reales el Panel de Métricas (tiempo promedio por etapa).</w:t>
+      </w:r>
+    </w:p>
+    <w:p>
+      <w:pPr>
+        <w:pStyle w:val="ListParagraph"/>
+        <w:numPr>
+          <w:ilvl w:val="0"/>
+          <w:numId w:val="2"/>
+        </w:numPr>
+        <w:spacing w:after="80"/>
+      </w:pPr>
+      <w:r>
+        <w:t xml:space="preserve">Rol de administrador, pantalla Candidatos y mensajes con bienvenida automática: ampliación acordada con la docente el 08/10/2026 (Secciones 5.7 a 5.10 y 6).</w:t>
+      </w:r>
+    </w:p>
+    <w:p>
+      <w:pPr>
+        <w:pStyle w:val="ListParagraph"/>
+        <w:numPr>
+          <w:ilvl w:val="0"/>
+          <w:numId w:val="2"/>
+        </w:numPr>
+        <w:spacing w:after="80"/>
+      </w:pPr>
+      <w:r>
+        <w:t xml:space="preserve">Pase de claridad pedido por la docente: nombres de secciones, ayuda en cada pantalla, estados vacíos, "Primeros pasos", validación y errores en español, recuperación de contraseña (Sección 5.11).</w:t>
+      </w:r>
+    </w:p>
+    <w:p>
+      <w:pPr>
+        <w:pStyle w:val="ListParagraph"/>
+        <w:numPr>
+          <w:ilvl w:val="0"/>
+          <w:numId w:val="2"/>
+        </w:numPr>
+        <w:spacing w:after="80"/>
+      </w:pPr>
+      <w:r>
+        <w:t xml:space="preserve">Cuatro pases de verificación completos (QA, E2E contra la base real, una suite de Playwright con navegador real en desktop y mobile, y pruebas adversariales de seguridad contra la base real), además de los tests unitarios — un nivel de rigor de verificación no exigido explícitamente por la especificación funcional.</w:t>
+      </w:r>
+    </w:p>
+    <w:p>
+      <w:pPr>
+        <w:pStyle w:val="ListParagraph"/>
+        <w:numPr>
+          <w:ilvl w:val="0"/>
+          <w:numId w:val="2"/>
+        </w:numPr>
+        <w:spacing w:after="80"/>
+      </w:pPr>
+      <w:r>
+        <w:t xml:space="preserve">Paginación en servidor del listado de Ofertas y lecturas por lotes en todo el sistema, para que la aplicación siga correcta pasado el límite de 1000 filas por lectura de Supabase (Sección 5.6).</w:t>
       </w:r>
     </w:p>
     <w:p>
@@ -1361,7 +1800,185 @@
         <w:spacing w:after="200" w:before="400"/>
       </w:pPr>
       <w:r>
-        <w:t xml:space="preserve">9. Conclusiones</w:t>
+        <w:t xml:space="preserve">9. Limitaciones conocidas y trabajo futuro</w:t>
+      </w:r>
+    </w:p>
+    <w:p>
+      <w:pPr>
+        <w:pStyle w:val="ListParagraph"/>
+        <w:numPr>
+          <w:ilvl w:val="0"/>
+          <w:numId w:val="2"/>
+        </w:numPr>
+        <w:spacing w:after="80"/>
+      </w:pPr>
+      <w:r>
+        <w:t xml:space="preserve">Recálculo de scores lento con volúmenes grandes: cambiar un peso con más de 1000 ofertas actualiza cientos de filas, de a diez en paralelo, y en las pruebas con 1100 ofertas tardó entre 25 segundos y 1,2 minutos según la corrida (más de un minuto en la medición más lenta). Es correcto pero no instantáneo. Mejora posible: una función SQL que recalcule todos los puntajes en una sola sentencia, sin una escritura por fila.</w:t>
+      </w:r>
+    </w:p>
+    <w:p>
+      <w:pPr>
+        <w:pStyle w:val="ListParagraph"/>
+        <w:numPr>
+          <w:ilvl w:val="0"/>
+          <w:numId w:val="2"/>
+        </w:numPr>
+        <w:spacing w:after="80"/>
+      </w:pPr>
+      <w:r>
+        <w:t xml:space="preserve">Importar ofertas inserta una por una (cada alta lee la sesión y los criterios): con muchas ofertas nuevas es lento. Un insert por lotes lo mejoraría.</w:t>
+      </w:r>
+    </w:p>
+    <w:p>
+      <w:pPr>
+        <w:pStyle w:val="ListParagraph"/>
+        <w:numPr>
+          <w:ilvl w:val="0"/>
+          <w:numId w:val="2"/>
+        </w:numPr>
+        <w:spacing w:after="80"/>
+      </w:pPr>
+      <w:r>
+        <w:t xml:space="preserve">Sin pruebas en un celular real ni en otros motores, y sin automatizar el teclado virtual real: la suite de Playwright usa Chromium emulado y solo simula el efecto del teclado (Sección 7).</w:t>
+      </w:r>
+    </w:p>
+    <w:p>
+      <w:pPr>
+        <w:pStyle w:val="ListParagraph"/>
+        <w:numPr>
+          <w:ilvl w:val="0"/>
+          <w:numId w:val="2"/>
+        </w:numPr>
+        <w:spacing w:after="80"/>
+      </w:pPr>
+      <w:r>
+        <w:t xml:space="preserve">Solo 2 de las 7 fuentes originales, sin automatización periódica: la búsqueda de ofertas externas depende de que el usuario toque "Importar" — no hay job de fondo (Sección 5.2 y 5.3).</w:t>
+      </w:r>
+    </w:p>
+    <w:p>
+      <w:pPr>
+        <w:pStyle w:val="ListParagraph"/>
+        <w:numPr>
+          <w:ilvl w:val="0"/>
+          <w:numId w:val="2"/>
+        </w:numPr>
+        <w:spacing w:after="80"/>
+      </w:pPr>
+      <w:r>
+        <w:t xml:space="preserve">Sin notificación por email: los recordatorios solo viven dentro de la aplicación (badge en Tablero y Ficha), no hay el mail de resumen diario que tenía el antecedente.</w:t>
+      </w:r>
+    </w:p>
+    <w:p>
+      <w:pPr>
+        <w:pStyle w:val="ListParagraph"/>
+        <w:numPr>
+          <w:ilvl w:val="0"/>
+          <w:numId w:val="2"/>
+        </w:numPr>
+        <w:spacing w:after="80"/>
+      </w:pPr>
+      <w:r>
+        <w:t xml:space="preserve">El motor de scoring no portó las reglas fijas heredadas del script anterior (recencia, seniority, exclusiones por keyword, idioma, salario): el puntaje depende exclusivamente de los criterios que el usuario configure. Si el usuario no configura ningún criterio, no hay ninguna señal de calidad de base.</w:t>
+      </w:r>
+    </w:p>
+    <w:p>
+      <w:pPr>
+        <w:pStyle w:val="ListParagraph"/>
+        <w:numPr>
+          <w:ilvl w:val="0"/>
+          <w:numId w:val="2"/>
+        </w:numPr>
+        <w:spacing w:after="80"/>
+      </w:pPr>
+      <w:r>
+        <w:t xml:space="preserve">La recuperación de contraseña depende del correo configurado en Supabase: con el servicio por defecto solo reciben el mail los miembros de la organización del proyecto y el tope es de 2 mensajes por hora, además de una espera de 60 segundos por usuario. Para usarla con personas reales hace falta un servicio de correo propio (SMTP).</w:t>
+      </w:r>
+    </w:p>
+    <w:p>
+      <w:pPr>
+        <w:pStyle w:val="ListParagraph"/>
+        <w:numPr>
+          <w:ilvl w:val="0"/>
+          <w:numId w:val="2"/>
+        </w:numPr>
+        <w:spacing w:after="80"/>
+      </w:pPr>
+      <w:r>
+        <w:t xml:space="preserve">El rol de administrador se asigna a mano por SQL: no hay pantalla para gestionarlo ni para quitarlo.</w:t>
+      </w:r>
+    </w:p>
+    <w:p>
+      <w:pPr>
+        <w:pStyle w:val="ListParagraph"/>
+        <w:numPr>
+          <w:ilvl w:val="0"/>
+          <w:numId w:val="2"/>
+        </w:numPr>
+        <w:spacing w:after="80"/>
+      </w:pPr>
+      <w:r>
+        <w:t xml:space="preserve">Los mensajes son de una sola vía (del equipo al candidato) y no hay notificación por email ni actualización en vivo: el contador de no leídos se actualiza al navegar, al volver a la pestaña y al operar en Mensajes.</w:t>
+      </w:r>
+    </w:p>
+    <w:p>
+      <w:pPr>
+        <w:pStyle w:val="ListParagraph"/>
+        <w:numPr>
+          <w:ilvl w:val="0"/>
+          <w:numId w:val="2"/>
+        </w:numPr>
+        <w:spacing w:after="80"/>
+      </w:pPr>
+      <w:r>
+        <w:t xml:space="preserve">El candidato puede borrar los mensajes que recibe y el administrador pierde ese mensaje de su historial de enviados.</w:t>
+      </w:r>
+    </w:p>
+    <w:p>
+      <w:pPr>
+        <w:pStyle w:val="ListParagraph"/>
+        <w:numPr>
+          <w:ilvl w:val="0"/>
+          <w:numId w:val="2"/>
+        </w:numPr>
+        <w:spacing w:after="80"/>
+      </w:pPr>
+      <w:r>
+        <w:t xml:space="preserve">Quienes omiten la configuración inicial no tienen perfil de búsqueda: no se listan en Candidatos y no reciben la bienvenida. Las cuentas anteriores a la ampliación no tienen nombre hasta que lo completen en Mi cuenta.</w:t>
+      </w:r>
+    </w:p>
+    <w:p>
+      <w:pPr>
+        <w:pStyle w:val="ListParagraph"/>
+        <w:numPr>
+          <w:ilvl w:val="0"/>
+          <w:numId w:val="2"/>
+        </w:numPr>
+        <w:spacing w:after="80"/>
+      </w:pPr>
+      <w:r>
+        <w:t xml:space="preserve">El indicador de fortaleza de contraseña orienta pero no bloquea: con 8 caracteres o más se puede elegir una contraseña que el medidor marca como débil.</w:t>
+      </w:r>
+    </w:p>
+    <w:p>
+      <w:pPr>
+        <w:pStyle w:val="ListParagraph"/>
+        <w:numPr>
+          <w:ilvl w:val="0"/>
+          <w:numId w:val="2"/>
+        </w:numPr>
+        <w:spacing w:after="80"/>
+      </w:pPr>
+      <w:r>
+        <w:t xml:space="preserve">Sin categorización de rol (QA / Data Entry / Admin / Data Analyst, u otra taxonomía): no hay forma de filtrar o tagear ofertas por categoría de puesto más allá de los criterios de texto libre que arme el propio usuario.</w:t>
+      </w:r>
+    </w:p>
+    <w:p>
+      <w:pPr>
+        <w:pStyle w:val="Heading1"/>
+        <w:spacing w:after="200" w:before="400"/>
+      </w:pPr>
+      <w:r>
+        <w:t xml:space="preserve">10. Conclusiones</w:t>
       </w:r>
     </w:p>
     <w:p>
@@ -1993,7 +2610,7 @@
                 <w:sz w:val="19"/>
                 <w:szCs w:val="19"/>
               </w:rPr>
-              <w:t xml:space="preserve">Listado filtrable por fuente, ubicación y score mínimo.</w:t>
+              <w:t xml:space="preserve">Listado filtrable por fuente, ubicación y puntaje mínimo (el control llega hasta el máximo posible con el perfil de cada usuario).</w:t>
             </w:r>
           </w:p>
         </w:tc>
@@ -3220,10 +3837,637 @@
     </w:tbl>
     <w:p>
       <w:pPr>
+        <w:pStyle w:val="Heading2"/>
+        <w:keepNext/>
+        <w:spacing w:after="140" w:before="280"/>
+      </w:pPr>
+      <w:r>
+        <w:t xml:space="preserve">Ampliación acordada con la docente (08/10/2026)</w:t>
+      </w:r>
+    </w:p>
+    <w:tbl>
+      <w:tblPr>
+        <w:tblW w:type="dxa" w:w="9026"/>
+        <w:tblBorders>
+          <w:top w:val="single" w:color="auto" w:sz="4"/>
+          <w:left w:val="single" w:color="auto" w:sz="4"/>
+          <w:bottom w:val="single" w:color="auto" w:sz="4"/>
+          <w:right w:val="single" w:color="auto" w:sz="4"/>
+          <w:insideH w:val="single" w:color="auto" w:sz="4"/>
+          <w:insideV w:val="single" w:color="auto" w:sz="4"/>
+        </w:tblBorders>
+      </w:tblPr>
+      <w:tblGrid>
+        <w:gridCol w:w="1100"/>
+        <w:gridCol w:w="1700"/>
+        <w:gridCol w:w="6226"/>
+      </w:tblGrid>
+      <w:tr>
+        <w:trPr>
+          <w:cantSplit/>
+          <w:tblHeader/>
+        </w:trPr>
+        <w:tc>
+          <w:tcPr>
+            <w:tcW w:type="dxa" w:w="1100"/>
+            <w:shd w:fill="1E4FD8" w:val="clear"/>
+            <w:tcMar>
+              <w:top w:type="dxa" w:w="80"/>
+              <w:left w:type="dxa" w:w="100"/>
+              <w:bottom w:type="dxa" w:w="80"/>
+              <w:right w:type="dxa" w:w="100"/>
+            </w:tcMar>
+            <w:vAlign w:val="center"/>
+          </w:tcPr>
+          <w:p>
+            <w:r>
+              <w:rPr>
+                <w:b/>
+                <w:bCs/>
+                <w:color w:val="FFFFFF"/>
+                <w:sz w:val="19"/>
+                <w:szCs w:val="19"/>
+              </w:rPr>
+              <w:t xml:space="preserve">Req.</w:t>
+            </w:r>
+          </w:p>
+        </w:tc>
+        <w:tc>
+          <w:tcPr>
+            <w:tcW w:type="dxa" w:w="1700"/>
+            <w:shd w:fill="1E4FD8" w:val="clear"/>
+            <w:tcMar>
+              <w:top w:type="dxa" w:w="80"/>
+              <w:left w:type="dxa" w:w="100"/>
+              <w:bottom w:type="dxa" w:w="80"/>
+              <w:right w:type="dxa" w:w="100"/>
+            </w:tcMar>
+            <w:vAlign w:val="center"/>
+          </w:tcPr>
+          <w:p>
+            <w:r>
+              <w:rPr>
+                <w:b/>
+                <w:bCs/>
+                <w:color w:val="FFFFFF"/>
+                <w:sz w:val="19"/>
+                <w:szCs w:val="19"/>
+              </w:rPr>
+              <w:t xml:space="preserve">Estado</w:t>
+            </w:r>
+          </w:p>
+        </w:tc>
+        <w:tc>
+          <w:tcPr>
+            <w:tcW w:type="dxa" w:w="6226"/>
+            <w:shd w:fill="1E4FD8" w:val="clear"/>
+            <w:tcMar>
+              <w:top w:type="dxa" w:w="80"/>
+              <w:left w:type="dxa" w:w="100"/>
+              <w:bottom w:type="dxa" w:w="80"/>
+              <w:right w:type="dxa" w:w="100"/>
+            </w:tcMar>
+            <w:vAlign w:val="center"/>
+          </w:tcPr>
+          <w:p>
+            <w:r>
+              <w:rPr>
+                <w:b/>
+                <w:bCs/>
+                <w:color w:val="FFFFFF"/>
+                <w:sz w:val="19"/>
+                <w:szCs w:val="19"/>
+              </w:rPr>
+              <w:t xml:space="preserve">Nota</w:t>
+            </w:r>
+          </w:p>
+        </w:tc>
+      </w:tr>
+      <w:tr>
+        <w:tc>
+          <w:tcPr>
+            <w:tcW w:type="dxa" w:w="1100"/>
+            <w:tcMar>
+              <w:top w:type="dxa" w:w="60"/>
+              <w:left w:type="dxa" w:w="100"/>
+              <w:bottom w:type="dxa" w:w="60"/>
+              <w:right w:type="dxa" w:w="100"/>
+            </w:tcMar>
+            <w:vAlign w:val="center"/>
+          </w:tcPr>
+          <w:p>
+            <w:r>
+              <w:rPr>
+                <w:b/>
+                <w:bCs/>
+                <w:color w:val="1A1A1A"/>
+                <w:sz w:val="19"/>
+                <w:szCs w:val="19"/>
+              </w:rPr>
+              <w:t xml:space="preserve">AMP-01</w:t>
+            </w:r>
+          </w:p>
+        </w:tc>
+        <w:tc>
+          <w:tcPr>
+            <w:tcW w:type="dxa" w:w="1700"/>
+            <w:tcMar>
+              <w:top w:type="dxa" w:w="60"/>
+              <w:left w:type="dxa" w:w="100"/>
+              <w:bottom w:type="dxa" w:w="60"/>
+              <w:right w:type="dxa" w:w="100"/>
+            </w:tcMar>
+            <w:vAlign w:val="center"/>
+          </w:tcPr>
+          <w:p>
+            <w:r>
+              <w:rPr>
+                <w:b/>
+                <w:bCs/>
+                <w:color w:val="1A7F37"/>
+                <w:sz w:val="19"/>
+                <w:szCs w:val="19"/>
+              </w:rPr>
+              <w:t xml:space="preserve">Cumplido</w:t>
+            </w:r>
+          </w:p>
+        </w:tc>
+        <w:tc>
+          <w:tcPr>
+            <w:tcW w:type="dxa" w:w="6226"/>
+            <w:tcMar>
+              <w:top w:type="dxa" w:w="60"/>
+              <w:left w:type="dxa" w:w="100"/>
+              <w:bottom w:type="dxa" w:w="60"/>
+              <w:right w:type="dxa" w:w="100"/>
+            </w:tcMar>
+            <w:vAlign w:val="center"/>
+          </w:tcPr>
+          <w:p>
+            <w:r>
+              <w:rPr>
+                <w:b w:val="false"/>
+                <w:bCs w:val="false"/>
+                <w:color w:val="1A1A1A"/>
+                <w:sz w:val="19"/>
+                <w:szCs w:val="19"/>
+              </w:rPr>
+              <w:t xml:space="preserve">Rol de administrador asignado por SQL; no se obtiene desde la interfaz ni se puede escalar desde la API (Sección 5.7).</w:t>
+            </w:r>
+          </w:p>
+        </w:tc>
+      </w:tr>
+      <w:tr>
+        <w:tc>
+          <w:tcPr>
+            <w:tcW w:type="dxa" w:w="1100"/>
+            <w:tcMar>
+              <w:top w:type="dxa" w:w="60"/>
+              <w:left w:type="dxa" w:w="100"/>
+              <w:bottom w:type="dxa" w:w="60"/>
+              <w:right w:type="dxa" w:w="100"/>
+            </w:tcMar>
+            <w:vAlign w:val="center"/>
+          </w:tcPr>
+          <w:p>
+            <w:r>
+              <w:rPr>
+                <w:b/>
+                <w:bCs/>
+                <w:color w:val="1A1A1A"/>
+                <w:sz w:val="19"/>
+                <w:szCs w:val="19"/>
+              </w:rPr>
+              <w:t xml:space="preserve">AMP-02</w:t>
+            </w:r>
+          </w:p>
+        </w:tc>
+        <w:tc>
+          <w:tcPr>
+            <w:tcW w:type="dxa" w:w="1700"/>
+            <w:tcMar>
+              <w:top w:type="dxa" w:w="60"/>
+              <w:left w:type="dxa" w:w="100"/>
+              <w:bottom w:type="dxa" w:w="60"/>
+              <w:right w:type="dxa" w:w="100"/>
+            </w:tcMar>
+            <w:vAlign w:val="center"/>
+          </w:tcPr>
+          <w:p>
+            <w:r>
+              <w:rPr>
+                <w:b/>
+                <w:bCs/>
+                <w:color w:val="1A7F37"/>
+                <w:sz w:val="19"/>
+                <w:szCs w:val="19"/>
+              </w:rPr>
+              <w:t xml:space="preserve">Cumplido</w:t>
+            </w:r>
+          </w:p>
+        </w:tc>
+        <w:tc>
+          <w:tcPr>
+            <w:tcW w:type="dxa" w:w="6226"/>
+            <w:tcMar>
+              <w:top w:type="dxa" w:w="60"/>
+              <w:left w:type="dxa" w:w="100"/>
+              <w:bottom w:type="dxa" w:w="60"/>
+              <w:right w:type="dxa" w:w="100"/>
+            </w:tcMar>
+            <w:vAlign w:val="center"/>
+          </w:tcPr>
+          <w:p>
+            <w:r>
+              <w:rPr>
+                <w:b w:val="false"/>
+                <w:bCs w:val="false"/>
+                <w:color w:val="1A1A1A"/>
+                <w:sz w:val="19"/>
+                <w:szCs w:val="19"/>
+              </w:rPr>
+              <w:t xml:space="preserve">Pantalla Candidatos con búsqueda y detalle, limitada al perfil de búsqueda; no se listan perfiles sin rol buscado (Sección 5.8).</w:t>
+            </w:r>
+          </w:p>
+        </w:tc>
+      </w:tr>
+      <w:tr>
+        <w:tc>
+          <w:tcPr>
+            <w:tcW w:type="dxa" w:w="1100"/>
+            <w:tcMar>
+              <w:top w:type="dxa" w:w="60"/>
+              <w:left w:type="dxa" w:w="100"/>
+              <w:bottom w:type="dxa" w:w="60"/>
+              <w:right w:type="dxa" w:w="100"/>
+            </w:tcMar>
+            <w:vAlign w:val="center"/>
+          </w:tcPr>
+          <w:p>
+            <w:r>
+              <w:rPr>
+                <w:b/>
+                <w:bCs/>
+                <w:color w:val="1A1A1A"/>
+                <w:sz w:val="19"/>
+                <w:szCs w:val="19"/>
+              </w:rPr>
+              <w:t xml:space="preserve">AMP-03</w:t>
+            </w:r>
+          </w:p>
+        </w:tc>
+        <w:tc>
+          <w:tcPr>
+            <w:tcW w:type="dxa" w:w="1700"/>
+            <w:tcMar>
+              <w:top w:type="dxa" w:w="60"/>
+              <w:left w:type="dxa" w:w="100"/>
+              <w:bottom w:type="dxa" w:w="60"/>
+              <w:right w:type="dxa" w:w="100"/>
+            </w:tcMar>
+            <w:vAlign w:val="center"/>
+          </w:tcPr>
+          <w:p>
+            <w:r>
+              <w:rPr>
+                <w:b/>
+                <w:bCs/>
+                <w:color w:val="1A7F37"/>
+                <w:sz w:val="19"/>
+                <w:szCs w:val="19"/>
+              </w:rPr>
+              <w:t xml:space="preserve">Cumplido</w:t>
+            </w:r>
+          </w:p>
+        </w:tc>
+        <w:tc>
+          <w:tcPr>
+            <w:tcW w:type="dxa" w:w="6226"/>
+            <w:tcMar>
+              <w:top w:type="dxa" w:w="60"/>
+              <w:left w:type="dxa" w:w="100"/>
+              <w:bottom w:type="dxa" w:w="60"/>
+              <w:right w:type="dxa" w:w="100"/>
+            </w:tcMar>
+            <w:vAlign w:val="center"/>
+          </w:tcPr>
+          <w:p>
+            <w:r>
+              <w:rPr>
+                <w:b w:val="false"/>
+                <w:bCs w:val="false"/>
+                <w:color w:val="1A1A1A"/>
+                <w:sz w:val="19"/>
+                <w:szCs w:val="19"/>
+              </w:rPr>
+              <w:t xml:space="preserve">Mensajes del administrador al candidato, con contador de no leídos, marcado como leído y borrado.</w:t>
+            </w:r>
+          </w:p>
+        </w:tc>
+      </w:tr>
+      <w:tr>
+        <w:tc>
+          <w:tcPr>
+            <w:tcW w:type="dxa" w:w="1100"/>
+            <w:tcMar>
+              <w:top w:type="dxa" w:w="60"/>
+              <w:left w:type="dxa" w:w="100"/>
+              <w:bottom w:type="dxa" w:w="60"/>
+              <w:right w:type="dxa" w:w="100"/>
+            </w:tcMar>
+            <w:vAlign w:val="center"/>
+          </w:tcPr>
+          <w:p>
+            <w:r>
+              <w:rPr>
+                <w:b/>
+                <w:bCs/>
+                <w:color w:val="1A1A1A"/>
+                <w:sz w:val="19"/>
+                <w:szCs w:val="19"/>
+              </w:rPr>
+              <w:t xml:space="preserve">AMP-04</w:t>
+            </w:r>
+          </w:p>
+        </w:tc>
+        <w:tc>
+          <w:tcPr>
+            <w:tcW w:type="dxa" w:w="1700"/>
+            <w:tcMar>
+              <w:top w:type="dxa" w:w="60"/>
+              <w:left w:type="dxa" w:w="100"/>
+              <w:bottom w:type="dxa" w:w="60"/>
+              <w:right w:type="dxa" w:w="100"/>
+            </w:tcMar>
+            <w:vAlign w:val="center"/>
+          </w:tcPr>
+          <w:p>
+            <w:r>
+              <w:rPr>
+                <w:b/>
+                <w:bCs/>
+                <w:color w:val="1A7F37"/>
+                <w:sz w:val="19"/>
+                <w:szCs w:val="19"/>
+              </w:rPr>
+              <w:t xml:space="preserve">Cumplido</w:t>
+            </w:r>
+          </w:p>
+        </w:tc>
+        <w:tc>
+          <w:tcPr>
+            <w:tcW w:type="dxa" w:w="6226"/>
+            <w:tcMar>
+              <w:top w:type="dxa" w:w="60"/>
+              <w:left w:type="dxa" w:w="100"/>
+              <w:bottom w:type="dxa" w:w="60"/>
+              <w:right w:type="dxa" w:w="100"/>
+            </w:tcMar>
+            <w:vAlign w:val="center"/>
+          </w:tcPr>
+          <w:p>
+            <w:r>
+              <w:rPr>
+                <w:b w:val="false"/>
+                <w:bCs w:val="false"/>
+                <w:color w:val="1A1A1A"/>
+                <w:sz w:val="19"/>
+                <w:szCs w:val="19"/>
+              </w:rPr>
+              <w:t xml:space="preserve">Mensaje de bienvenida automático al completar el perfil (trigger, Sección 5.9).</w:t>
+            </w:r>
+          </w:p>
+        </w:tc>
+      </w:tr>
+      <w:tr>
+        <w:tc>
+          <w:tcPr>
+            <w:tcW w:type="dxa" w:w="1100"/>
+            <w:tcMar>
+              <w:top w:type="dxa" w:w="60"/>
+              <w:left w:type="dxa" w:w="100"/>
+              <w:bottom w:type="dxa" w:w="60"/>
+              <w:right w:type="dxa" w:w="100"/>
+            </w:tcMar>
+            <w:vAlign w:val="center"/>
+          </w:tcPr>
+          <w:p>
+            <w:r>
+              <w:rPr>
+                <w:b/>
+                <w:bCs/>
+                <w:color w:val="1A1A1A"/>
+                <w:sz w:val="19"/>
+                <w:szCs w:val="19"/>
+              </w:rPr>
+              <w:t xml:space="preserve">AMP-05</w:t>
+            </w:r>
+          </w:p>
+        </w:tc>
+        <w:tc>
+          <w:tcPr>
+            <w:tcW w:type="dxa" w:w="1700"/>
+            <w:tcMar>
+              <w:top w:type="dxa" w:w="60"/>
+              <w:left w:type="dxa" w:w="100"/>
+              <w:bottom w:type="dxa" w:w="60"/>
+              <w:right w:type="dxa" w:w="100"/>
+            </w:tcMar>
+            <w:vAlign w:val="center"/>
+          </w:tcPr>
+          <w:p>
+            <w:r>
+              <w:rPr>
+                <w:b/>
+                <w:bCs/>
+                <w:color w:val="1A7F37"/>
+                <w:sz w:val="19"/>
+                <w:szCs w:val="19"/>
+              </w:rPr>
+              <w:t xml:space="preserve">Cumplido</w:t>
+            </w:r>
+          </w:p>
+        </w:tc>
+        <w:tc>
+          <w:tcPr>
+            <w:tcW w:type="dxa" w:w="6226"/>
+            <w:tcMar>
+              <w:top w:type="dxa" w:w="60"/>
+              <w:left w:type="dxa" w:w="100"/>
+              <w:bottom w:type="dxa" w:w="60"/>
+              <w:right w:type="dxa" w:w="100"/>
+            </w:tcMar>
+            <w:vAlign w:val="center"/>
+          </w:tcPr>
+          <w:p>
+            <w:r>
+              <w:rPr>
+                <w:b w:val="false"/>
+                <w:bCs w:val="false"/>
+                <w:color w:val="1A1A1A"/>
+                <w:sz w:val="19"/>
+                <w:szCs w:val="19"/>
+              </w:rPr>
+              <w:t xml:space="preserve">Aviso de privacidad en la configuración inicial y en Mi cuenta (Sección 6).</w:t>
+            </w:r>
+          </w:p>
+        </w:tc>
+      </w:tr>
+      <w:tr>
+        <w:tc>
+          <w:tcPr>
+            <w:tcW w:type="dxa" w:w="1100"/>
+            <w:tcMar>
+              <w:top w:type="dxa" w:w="60"/>
+              <w:left w:type="dxa" w:w="100"/>
+              <w:bottom w:type="dxa" w:w="60"/>
+              <w:right w:type="dxa" w:w="100"/>
+            </w:tcMar>
+            <w:vAlign w:val="center"/>
+          </w:tcPr>
+          <w:p>
+            <w:r>
+              <w:rPr>
+                <w:b/>
+                <w:bCs/>
+                <w:color w:val="1A1A1A"/>
+                <w:sz w:val="19"/>
+                <w:szCs w:val="19"/>
+              </w:rPr>
+              <w:t xml:space="preserve">AMP-06</w:t>
+            </w:r>
+          </w:p>
+        </w:tc>
+        <w:tc>
+          <w:tcPr>
+            <w:tcW w:type="dxa" w:w="1700"/>
+            <w:tcMar>
+              <w:top w:type="dxa" w:w="60"/>
+              <w:left w:type="dxa" w:w="100"/>
+              <w:bottom w:type="dxa" w:w="60"/>
+              <w:right w:type="dxa" w:w="100"/>
+            </w:tcMar>
+            <w:vAlign w:val="center"/>
+          </w:tcPr>
+          <w:p>
+            <w:r>
+              <w:rPr>
+                <w:b/>
+                <w:bCs/>
+                <w:color w:val="B06A00"/>
+                <w:sz w:val="19"/>
+                <w:szCs w:val="19"/>
+              </w:rPr>
+              <w:t xml:space="preserve">Cumplido, con matiz</w:t>
+            </w:r>
+          </w:p>
+        </w:tc>
+        <w:tc>
+          <w:tcPr>
+            <w:tcW w:type="dxa" w:w="6226"/>
+            <w:tcMar>
+              <w:top w:type="dxa" w:w="60"/>
+              <w:left w:type="dxa" w:w="100"/>
+              <w:bottom w:type="dxa" w:w="60"/>
+              <w:right w:type="dxa" w:w="100"/>
+            </w:tcMar>
+            <w:vAlign w:val="center"/>
+          </w:tcPr>
+          <w:p>
+            <w:r>
+              <w:rPr>
+                <w:b w:val="false"/>
+                <w:bCs w:val="false"/>
+                <w:color w:val="1A1A1A"/>
+                <w:sz w:val="19"/>
+                <w:szCs w:val="19"/>
+              </w:rPr>
+              <w:t xml:space="preserve">Recuperación de contraseña por email con mensaje neutro; con el correo por defecto de Supabase tiene límites de envío (Sección 9).</w:t>
+            </w:r>
+          </w:p>
+        </w:tc>
+      </w:tr>
+      <w:tr>
+        <w:tc>
+          <w:tcPr>
+            <w:tcW w:type="dxa" w:w="1100"/>
+            <w:tcMar>
+              <w:top w:type="dxa" w:w="60"/>
+              <w:left w:type="dxa" w:w="100"/>
+              <w:bottom w:type="dxa" w:w="60"/>
+              <w:right w:type="dxa" w:w="100"/>
+            </w:tcMar>
+            <w:vAlign w:val="center"/>
+          </w:tcPr>
+          <w:p>
+            <w:r>
+              <w:rPr>
+                <w:b/>
+                <w:bCs/>
+                <w:color w:val="1A1A1A"/>
+                <w:sz w:val="19"/>
+                <w:szCs w:val="19"/>
+              </w:rPr>
+              <w:t xml:space="preserve">AMP-07</w:t>
+            </w:r>
+          </w:p>
+        </w:tc>
+        <w:tc>
+          <w:tcPr>
+            <w:tcW w:type="dxa" w:w="1700"/>
+            <w:tcMar>
+              <w:top w:type="dxa" w:w="60"/>
+              <w:left w:type="dxa" w:w="100"/>
+              <w:bottom w:type="dxa" w:w="60"/>
+              <w:right w:type="dxa" w:w="100"/>
+            </w:tcMar>
+            <w:vAlign w:val="center"/>
+          </w:tcPr>
+          <w:p>
+            <w:r>
+              <w:rPr>
+                <w:b/>
+                <w:bCs/>
+                <w:color w:val="1A7F37"/>
+                <w:sz w:val="19"/>
+                <w:szCs w:val="19"/>
+              </w:rPr>
+              <w:t xml:space="preserve">Cumplido</w:t>
+            </w:r>
+          </w:p>
+        </w:tc>
+        <w:tc>
+          <w:tcPr>
+            <w:tcW w:type="dxa" w:w="6226"/>
+            <w:tcMar>
+              <w:top w:type="dxa" w:w="60"/>
+              <w:left w:type="dxa" w:w="100"/>
+              <w:bottom w:type="dxa" w:w="60"/>
+              <w:right w:type="dxa" w:w="100"/>
+            </w:tcMar>
+            <w:vAlign w:val="center"/>
+          </w:tcPr>
+          <w:p>
+            <w:r>
+              <w:rPr>
+                <w:b w:val="false"/>
+                <w:bCs w:val="false"/>
+                <w:color w:val="1A1A1A"/>
+                <w:sz w:val="19"/>
+                <w:szCs w:val="19"/>
+              </w:rPr>
+              <w:t xml:space="preserve">Claridad de la interfaz: nombres, ayuda, estados vacíos, "Primeros pasos", validación y errores en español (Sección 5.11).</w:t>
+            </w:r>
+          </w:p>
+        </w:tc>
+      </w:tr>
+    </w:tbl>
+    <w:p>
+      <w:pPr>
         <w:spacing w:after="160" w:before="280"/>
       </w:pPr>
       <w:r>
-        <w:t xml:space="preserve">En síntesis: de los 17 RF originales, 12 se cumplieron (10 tal como fueron especificados, 1 ampliado — RF-10 — y 1 cumplido con matices — RF-13), 3 se cumplieron parcialmente (RF-01, RF-04, RF-05) y 2 no se implementaron (RF-03, RF-16). De los 5 RNF, 3 se cumplieron, 1 se amplió deliberadamente por sobre lo previsto (RNF-02) y 1 no se cumplió (RNF-05). Ninguno de los recortes fue accidental: cada uno queda documentado con su alternativa descartada en la Sección 5 o como limitación conocida en la Sección 8, en vez de quedar implícito.</w:t>
+        <w:t xml:space="preserve">En síntesis: de los 17 RF originales, 12 se cumplieron (10 tal como fueron especificados, 1 ampliado — RF-10 — y 1 cumplido con matices — RF-13), 3 se cumplieron parcialmente (RF-01, RF-04, RF-05) y 2 no se implementaron (RF-03, RF-16). De los 5 RNF, 3 se cumplieron, 1 se amplió deliberadamente por sobre lo previsto (RNF-02) y 1 no se cumplió (RNF-05). A eso se suman las 7 ampliaciones acordadas con la docente el 08/10/2026: 6 cumplidas y 1 con matices (la recuperación de contraseña depende del correo configurado). Ninguno de los recortes fue accidental: cada uno queda documentado con su alternativa descartada en la Sección 5 o como limitación conocida en la Sección 9, en vez de quedar implícito.</w:t>
       </w:r>
     </w:p>
     <w:sectPr>

</xml_diff>